<commit_message>
some discussion edits and fix table
</commit_message>
<xml_diff>
--- a/_manuscript/index.docx
+++ b/_manuscript/index.docx
@@ -31,7 +31,7 @@
         <w:pStyle w:val="Date"/>
       </w:pPr>
       <w:r>
-        <w:t xml:space="preserve">2026-03-16</w:t>
+        <w:t xml:space="preserve">2026-03-17</w:t>
       </w:r>
     </w:p>
     <w:p>
@@ -99,7 +99,7 @@
         <w:t xml:space="preserve">(Substance Abuse and Mental Health Services Administration, n.d.)</w:t>
       </w:r>
       <w:r>
-        <w:t xml:space="preserve">. OUD is associated with elevated mortality and morbidity, including increased risk of infectious disease, psychiatric comorbidity, and disability</w:t>
+        <w:t xml:space="preserve">. OUD is associated with increased rates of mortality and morbidity, including infectious disease, psychiatric comorbidity, and disability</w:t>
       </w:r>
       <w:r>
         <w:t xml:space="preserve"> </w:t>
@@ -134,7 +134,7 @@
         <w:t xml:space="preserve">(Ma et al., 2019)</w:t>
       </w:r>
       <w:r>
-        <w:t xml:space="preserve">. They are also associated with improvements in mental health and social functioning, particularly when maintained over extended periods. However, despite strong evidence for MOUD, access remains limited and treatment dropout is common.</w:t>
+        <w:t xml:space="preserve">. They are also associated with improvements in mental health and social functioning, particularly when maintained over extended periods. However, despite strong evidence for MOUD, access remains limited.</w:t>
       </w:r>
     </w:p>
     <w:p>
@@ -159,7 +159,23 @@
         <w:pStyle w:val="BodyText"/>
       </w:pPr>
       <w:r>
-        <w:t xml:space="preserve">Identifying vulnerable periods of high lapse risk and contextualizing that risk (e.g., by explaining the top features influencing risk) could enable individuals to take proactive action to prevent lapse. However, the risk factors that precipitate lapses are highly individualized, numerous, dynamic, and interactive. The optimal supports to address these risks vary both across individuals and within individuals over time. Thus, effective interventions must be personalized to both the individual and the moment to meet the complex and changing needs of people in recovery.</w:t>
+        <w:t xml:space="preserve">Identifying vulnerable periods of high lapse risk and contextualizing that risk (i.e.,</w:t>
+      </w:r>
+      <w:r>
+        <w:t xml:space="preserve"> </w:t>
+      </w:r>
+      <w:r>
+        <w:rPr>
+          <w:i/>
+          <w:iCs/>
+        </w:rPr>
+        <w:t xml:space="preserve">Why</w:t>
+      </w:r>
+      <w:r>
+        <w:t xml:space="preserve"> </w:t>
+      </w:r>
+      <w:r>
+        <w:t xml:space="preserve">risk is high) could enable individuals to take proactive action to prevent lapse. However, the risk factors that precipitate lapses are highly individualized, numerous, dynamic, and interactive. The optimal supports to address these risks vary both across individuals and within individuals over time. Thus, effective interventions must be personalized to both the individual and the moment to meet the complex and changing needs of people in recovery.</w:t>
       </w:r>
     </w:p>
     <w:p>

</xml_diff>

<commit_message>
small updates to discussion
</commit_message>
<xml_diff>
--- a/_manuscript/index.docx
+++ b/_manuscript/index.docx
@@ -227,7 +227,7 @@
         <w:t xml:space="preserve">(Jones et al., 2019; Wyant et al., 2023)</w:t>
       </w:r>
       <w:r>
-        <w:t xml:space="preserve">. However, it is less clear to what extent people in recovery from illicit substance use disorders can, or are willing to, report risk information accurately enough to develop prediction models. People with SUDs may experience greater instability in their day-to-day lives (e.g., stigma or legal consequences may make access to healthcare, stable housing, or supportive relationships more difficult). This instability could make it difficult to recall and report recent behaviors and events promptly or accurately. It may also skew baseline perceptions of what constitutes a risky or stressful experience.</w:t>
+        <w:t xml:space="preserve">. However, it is less clear to what extent people in recovery from illicit substance use disorders can, or are willing to, report risk information accurately enough to develop prediction models. People with substance use disorders (SUD) may experience greater instability in their day-to-day lives (e.g., stigma or legal consequences may make access to healthcare, stable housing, or supportive relationships more difficult). This instability could make it difficult to recall and report recent behaviors and events promptly or accurately. It may also skew baseline perceptions of what constitutes a risky or stressful experience.</w:t>
       </w:r>
     </w:p>
     <w:p>
@@ -294,17 +294,7 @@
         <w:t xml:space="preserve"> </w:t>
       </w:r>
       <w:r>
-        <w:t xml:space="preserve">(</w:t>
-      </w:r>
-      <w:r>
-        <w:rPr>
-          <w:b/>
-          <w:bCs/>
-        </w:rPr>
-        <w:t xml:space="preserve">collinsTRIPODAIStatementUpdated2024?</w:t>
-      </w:r>
-      <w:r>
-        <w:t xml:space="preserve">)</w:t>
+        <w:t xml:space="preserve">(Collins et al., 2024)</w:t>
       </w:r>
       <w:r>
         <w:t xml:space="preserve">. A TRIPOD+AI checklist is available in the supplement.</w:t>
@@ -510,33 +500,7 @@
         <w:t xml:space="preserve"> </w:t>
       </w:r>
       <w:r>
-        <w:t xml:space="preserve">(Greenfield et al., 2007; Kilaru et al., 2020; Lofaro et al., 2025; Olfson et al., 2022; Pinedo, 2019;</w:t>
-      </w:r>
-      <w:r>
-        <w:t xml:space="preserve"> </w:t>
-      </w:r>
-      <w:r>
-        <w:rPr>
-          <w:b/>
-          <w:bCs/>
-        </w:rPr>
-        <w:t xml:space="preserve">martinNeedReceiptSubstance2022?</w:t>
-      </w:r>
-      <w:r>
-        <w:t xml:space="preserve">;</w:t>
-      </w:r>
-      <w:r>
-        <w:t xml:space="preserve"> </w:t>
-      </w:r>
-      <w:r>
-        <w:rPr>
-          <w:b/>
-          <w:bCs/>
-        </w:rPr>
-        <w:t xml:space="preserve">xinExploringIntersectionalityStigma2023?</w:t>
-      </w:r>
-      <w:r>
-        <w:t xml:space="preserve">)</w:t>
+        <w:t xml:space="preserve">(Greenfield et al., 2007; Kilaru et al., 2020; Lofaro et al., 2025; Martin et al., 2022; Olfson et al., 2022; Pinedo, 2019; Xin et al., 2023)</w:t>
       </w:r>
       <w:r>
         <w:t xml:space="preserve">.</w:t>
@@ -553,17 +517,7 @@
         <w:t xml:space="preserve"> </w:t>
       </w:r>
       <w:r>
-        <w:t xml:space="preserve">(</w:t>
-      </w:r>
-      <w:r>
-        <w:rPr>
-          <w:b/>
-          <w:bCs/>
-        </w:rPr>
-        <w:t xml:space="preserve">americanpsychiatricassociationDiagnosticStatisticalManual2022?</w:t>
-      </w:r>
-      <w:r>
-        <w:t xml:space="preserve">)</w:t>
+        <w:t xml:space="preserve">(American Psychiatric Association, 2022)</w:t>
       </w:r>
       <w:r>
         <w:t xml:space="preserve">, past month opioid use, past month residential treatment for OUD, past month receipt of psychiatric medication, preferred opioid, preferred route of administration, and lifetime history of overdose. As part of the aims of the parent project, we collected many other trait and state measures throughout the study. A complete list of all measures can be found in our registered report</w:t>
@@ -884,17 +838,7 @@
         <w:t xml:space="preserve"> </w:t>
       </w:r>
       <w:r>
-        <w:t xml:space="preserve">(</w:t>
-      </w:r>
-      <w:r>
-        <w:rPr>
-          <w:b/>
-          <w:bCs/>
-        </w:rPr>
-        <w:t xml:space="preserve">vandewieleOverlyOptimisticPrediction2021?</w:t>
-      </w:r>
-      <w:r>
-        <w:t xml:space="preserve">)</w:t>
+        <w:t xml:space="preserve">(Vandewiele et al., 2021)</w:t>
       </w:r>
       <w:r>
         <w:t xml:space="preserve">. All model configurations were fit for the full model and the three feature ablation models (ablated daily survey features, ablated geolocation features, and ablated daily survey and geolocation features combined).</w:t>
@@ -1001,17 +945,7 @@
         <w:t xml:space="preserve"> </w:t>
       </w:r>
       <w:r>
-        <w:t xml:space="preserve">(</w:t>
-      </w:r>
-      <w:r>
-        <w:rPr>
-          <w:b/>
-          <w:bCs/>
-        </w:rPr>
-        <w:t xml:space="preserve">plattProbabilisticOutputsSupport1999?</w:t>
-      </w:r>
-      <w:r>
-        <w:t xml:space="preserve">)</w:t>
+        <w:t xml:space="preserve">(Platt, 1999)</w:t>
       </w:r>
       <w:r>
         <w:t xml:space="preserve">. We provided a calibration plot of these raw and calibrated probabilities. To characterize overall performance we reported Brier scores for the raw and calibrated probabilities. Brier scores are the mean squared difference between the predicted probabilities and observed outcome and range from 0 (perfect accuracy) to 1 (perfect inaccuracy). We also provided histograms of risk probability distributions by true lapse outcome.</w:t>
@@ -5736,7 +5670,7 @@
         <w:pStyle w:val="FirstParagraph"/>
       </w:pPr>
       <w:r>
-        <w:t xml:space="preserve">Our full model demonstrated that it is possible to predict future next-day lapses back to opioid use with high accuracy using smartphone sensing methods (auROC = 0.94). Our model’s predictions were well-calibrated, meaning that our probabilities closely matched true observed lapse rates. This is exciting given that our goal was to build a model that could provide insight into lapse risk.</w:t>
+        <w:t xml:space="preserve">Our full model demonstrated that it is possible to future next-day lapses back to opioid use with high accuracy using smartphone sensing data (auROC = 0.94). Model predictions were well-calibrated, with estimated probabilities closely aligning with observed lapse rates. This is exciting given that our goal was to build a model that could provide insight into lapse risk.</w:t>
       </w:r>
     </w:p>
     <w:p>
@@ -5744,7 +5678,7 @@
         <w:pStyle w:val="BodyText"/>
       </w:pPr>
       <w:r>
-        <w:t xml:space="preserve">Ablation model comparisons revealed that daily surveys alone captured nearly all of this predictive signal (auROC = 0.94). To our knowledge, no other published substance use studies have collected daily survey data from participants continuously over the course of one year. Survey adherence rates in our sample were comparable to those observed in other clinical populations, suggesting that self‑report surveys are a feasible and scalable sensing method for long‑term monitoring in this population.</w:t>
+        <w:t xml:space="preserve">Ablation model comparisons revealed that daily surveys alone captured nearly all of this predictive signal (auROC = 0.94). To our knowledge, no other published SUD study has collected daily survey data from participants continuously over the course of one year. Survey adherence rates in our sample were comparable to those observed in other clinical populations, suggesting that self‑report surveys are a feasible and risk-relevant sensing method for long‑term monitoring in this population.</w:t>
       </w:r>
     </w:p>
     <w:p>
@@ -5752,7 +5686,7 @@
         <w:pStyle w:val="BodyText"/>
       </w:pPr>
       <w:r>
-        <w:t xml:space="preserve">When daily surveys were ablated from the model, predictive performance dropped substantially (auROC = 0.63). Although this performance remained above chance and exceeded that of a demographics‑only model (with both geolocation and daily surveys ablated; auROC = 0.55), it indicates that geolocation features captured only modest independent predictive signal. Moreover, given that ablating geolocation features did not result in any drop in performance, this signal likely overlaps with information already captured with the daily surveys. It is possible that the relatively low predictive value of geolocation sensing in this study was due to methodological limitations.</w:t>
+        <w:t xml:space="preserve">When daily surveys were ablated from the model, predictive performance dropped substantially (auROC = 0.63). Although this performance remained above chance and exceeded that of a demographics‑only model (with both geolocation and daily surveys ablated; auROC = 0.55), it indicates that geolocation features captured only modest predictive signal. Moreover, given that ablating geolocation features did not result in any drop in performance, this signal likely overlaps with information already captured with the daily surveys. It is possible that the relatively low predictive value of geolocation sensing in this study was due to methodological limitations.</w:t>
       </w:r>
     </w:p>
     <w:p>
@@ -5800,7 +5734,7 @@
         <w:pStyle w:val="BodyText"/>
       </w:pPr>
       <w:r>
-        <w:t xml:space="preserve">When using a standard mean absolute Shapley value approach to estimate feature importance, the most important feature was prior opioid use. This finding is consistent with the relapse‑prevention literature, which identifies lapse as an important precursor to relapse, as well as prior prediction research demonstrating that lapses predict future lapses</w:t>
+        <w:t xml:space="preserve">When using a standard mean absolute Shapley value approach to estimate average feature importance across observations, the most important feature was prior opioid use. This finding is consistent with the relapse‑prevention literature, which identifies lapse as an important precursor to relapse, and prior prediction research demonstrating that lapses predict future lapses</w:t>
       </w:r>
       <w:r>
         <w:t xml:space="preserve"> </w:t>
@@ -5809,7 +5743,7 @@
         <w:t xml:space="preserve">(Wyant et al., 2024)</w:t>
       </w:r>
       <w:r>
-        <w:t xml:space="preserve">. Notably, this feature had a mean absolute Shapley value that was nearly two-fold higher than the next most important feature. When considering this model in the context of a recovery support monitoring system that provides daily insight into lapse risk, this finding may be misleading. Fewer than 2% of day-level observations contained a lapse, and the majority of participants did not lapse at all. Among those who did lapse, many only lapsed one time. Given that lapse cannot be used as a predictor until after it has occurred, other features may represent more actionable and clinically meaningful targets for intervention in most cases.</w:t>
+        <w:t xml:space="preserve">. Notably, this feature had a mean absolute Shapley value that was nearly two-fold higher than the next most important feature. When considering this model in the context of a recovery monitoring support system that provides daily insight into lapse risk, this finding may be misleading. Fewer than 2% of day-level observations contained a lapse, and the majority of participants did not lapse at all. Among those who did lapse, many only lapsed one time. Given that lapse cannot be used as a predictor until after it has occurred, in most cases other features may represent more clinically meaningful targets for intervention.</w:t>
       </w:r>
     </w:p>
     <w:p>
@@ -5817,7 +5751,7 @@
         <w:pStyle w:val="BodyText"/>
       </w:pPr>
       <w:r>
-        <w:t xml:space="preserve">A more informative approach to characterize feature importance is to consider the proportion of observations in which a given feature had the highest Shapley value. This approach considers both the magnitude of a feature’s effect (in terms of log-odds change in the prediction) and its prevalence across observations. Using this approach, urge ratings and abstinence confidence emerged as the features most frequently influencing lapse risk predictions. This suggests that individuals may benefit more often from recovery recommendations focussed on reducing urges (e.g., urge surfing) and increasing abstinence confidence (e.g., reflecting on recent successes). Additionally, this approach showed that while some features have low average importance across all individuals and observations, they can be highly important on certain days for certain individuals (e.g., self-reports of anger).</w:t>
+        <w:t xml:space="preserve">A more informative approach to characterize feature importance is to consider the proportion of observations in which a given feature had the highest Shapley value. This approach considers both the magnitude of a feature’s effect (in terms of log-odds change in the prediction) and its prevalence across observations. Using this approach, urge ratings and abstinence confidence emerged as the features most frequently influencing lapse risk predictions. This suggests that individuals may benefit more often from recovery recommendations focussed on reducing urges (e.g., urge surfing) and increasing abstinence confidence (e.g., reflecting on recent successes). Additionally, this approach showed that while some features have low average importance (across all individuals and observations), they can be highly important on certain days for certain individuals (e.g., self-reports of anger).</w:t>
       </w:r>
     </w:p>
     <w:p>
@@ -5825,7 +5759,7 @@
         <w:pStyle w:val="BodyText"/>
       </w:pPr>
       <w:r>
-        <w:t xml:space="preserve">Across both feature importance approaches, geolocation features emerged among the top subset of features. Specifically, location variance, time spent in helpful and harmful locations, and time spent at locations were religious activities are performed were among the top ten features. These findings suggest that although geolocation features may not provide unique signal for prediction, it may be worthwhile to still include them in the model to expand opportunities for intervention and provide precision-oriented recovery support.</w:t>
+        <w:t xml:space="preserve">Across both feature importance approaches, geolocation features emerged among the top subset of features. Specifically, location variance, time spent in helpful and harmful locations, and time spent at locations where religious activities are performed were among the top ten features. These findings suggest that although geolocation features may not provide unique signal for prediction, it may be worthwhile to still include them in the model to expand opportunities for intervention and provide precision-oriented recovery support.</w:t>
       </w:r>
     </w:p>
     <w:p>
@@ -5853,7 +5787,7 @@
       </w:r>
     </w:p>
     <w:bookmarkEnd w:id="77"/>
-    <w:bookmarkStart w:id="125" w:name="references"/>
+    <w:bookmarkStart w:id="135" w:name="references"/>
     <w:p>
       <w:pPr>
         <w:pStyle w:val="Heading1"/>
@@ -5862,13 +5796,50 @@
         <w:t xml:space="preserve">References</w:t>
       </w:r>
     </w:p>
-    <w:bookmarkStart w:id="124" w:name="refs"/>
-    <w:bookmarkStart w:id="79" w:name="ref-chtc"/>
+    <w:bookmarkStart w:id="134" w:name="refs"/>
+    <w:bookmarkStart w:id="78" w:name="Xa6cc3d705527cff91ec886314240e7a8b04e8dd"/>
     <w:p>
       <w:pPr>
         <w:pStyle w:val="Bibliography"/>
       </w:pPr>
       <w:r>
+        <w:t xml:space="preserve">American Psychiatric Association. (2022).</w:t>
+      </w:r>
+      <w:r>
+        <w:t xml:space="preserve"> </w:t>
+      </w:r>
+      <w:r>
+        <w:rPr>
+          <w:i/>
+          <w:iCs/>
+        </w:rPr>
+        <w:t xml:space="preserve">Diagnostic and statistical manual of mental disorders :</w:t>
+      </w:r>
+      <w:r>
+        <w:rPr>
+          <w:i/>
+          <w:iCs/>
+        </w:rPr>
+        <w:t xml:space="preserve"> </w:t>
+      </w:r>
+      <w:r>
+        <w:rPr>
+          <w:i/>
+          <w:iCs/>
+        </w:rPr>
+        <w:t xml:space="preserve">DSM-5-TR</w:t>
+      </w:r>
+      <w:r>
+        <w:t xml:space="preserve">. 5th edition, text revision. Washington, DC : American Psychiatric Association Publishing, 2022.</w:t>
+      </w:r>
+    </w:p>
+    <w:bookmarkEnd w:id="78"/>
+    <w:bookmarkStart w:id="80" w:name="ref-chtc"/>
+    <w:p>
+      <w:pPr>
+        <w:pStyle w:val="Bibliography"/>
+      </w:pPr>
+      <w:r>
         <w:t xml:space="preserve">Center for High Throughput Computing. (2006).</w:t>
       </w:r>
       <w:r>
@@ -5887,7 +5858,7 @@
       <w:r>
         <w:t xml:space="preserve"> </w:t>
       </w:r>
-      <w:hyperlink r:id="rId78">
+      <w:hyperlink r:id="rId79">
         <w:r>
           <w:rPr>
             <w:rStyle w:val="Hyperlink"/>
@@ -5896,13 +5867,78 @@
         </w:r>
       </w:hyperlink>
     </w:p>
-    <w:bookmarkEnd w:id="79"/>
-    <w:bookmarkStart w:id="80" w:name="X5df69cab398edda98b0028d1d2ef3313da2d6d1"/>
+    <w:bookmarkEnd w:id="80"/>
+    <w:bookmarkStart w:id="82" w:name="ref-collinsTRIPODAIStatementUpdated2024"/>
     <w:p>
       <w:pPr>
         <w:pStyle w:val="Bibliography"/>
       </w:pPr>
       <w:r>
+        <w:t xml:space="preserve">Collins, G. S., Moons, K. G. M., Dhiman, P., Riley, R. D., Beam, A. L., Van Calster, B., Ghassemi, M., Liu, X., Reitsma, J. B., Van Smeden, M., Boulesteix, A.-L., Camaradou, J. C., Celi, L. A., Denaxas, S., Denniston, A. K., Glocker, B., Golub, R. M., Harvey, H., Heinze, G., … Logullo, P. (2024).</w:t>
+      </w:r>
+      <w:r>
+        <w:t xml:space="preserve"> </w:t>
+      </w:r>
+      <w:r>
+        <w:t xml:space="preserve">TRIPOD</w:t>
+      </w:r>
+      <w:r>
+        <w:t xml:space="preserve">+</w:t>
+      </w:r>
+      <w:r>
+        <w:t xml:space="preserve">AI</w:t>
+      </w:r>
+      <w:r>
+        <w:t xml:space="preserve"> </w:t>
+      </w:r>
+      <w:r>
+        <w:t xml:space="preserve">statement: Updated guidance for reporting clinical prediction models that use regression or machine learning methods.</w:t>
+      </w:r>
+      <w:r>
+        <w:t xml:space="preserve"> </w:t>
+      </w:r>
+      <w:r>
+        <w:rPr>
+          <w:i/>
+          <w:iCs/>
+        </w:rPr>
+        <w:t xml:space="preserve">BMJ</w:t>
+      </w:r>
+      <w:r>
+        <w:t xml:space="preserve">,</w:t>
+      </w:r>
+      <w:r>
+        <w:t xml:space="preserve"> </w:t>
+      </w:r>
+      <w:r>
+        <w:rPr>
+          <w:i/>
+          <w:iCs/>
+        </w:rPr>
+        <w:t xml:space="preserve">385</w:t>
+      </w:r>
+      <w:r>
+        <w:t xml:space="preserve">, e078378.</w:t>
+      </w:r>
+      <w:r>
+        <w:t xml:space="preserve"> </w:t>
+      </w:r>
+      <w:hyperlink r:id="rId81">
+        <w:r>
+          <w:rPr>
+            <w:rStyle w:val="Hyperlink"/>
+          </w:rPr>
+          <w:t xml:space="preserve">https://doi.org/10.1136/bmj-2023-078378</w:t>
+        </w:r>
+      </w:hyperlink>
+    </w:p>
+    <w:bookmarkEnd w:id="82"/>
+    <w:bookmarkStart w:id="83" w:name="X5df69cab398edda98b0028d1d2ef3313da2d6d1"/>
+    <w:p>
+      <w:pPr>
+        <w:pStyle w:val="Bibliography"/>
+      </w:pPr>
+      <w:r>
         <w:t xml:space="preserve">Economic Research Service US Department of Agriculture. (n.d.).</w:t>
       </w:r>
       <w:r>
@@ -5975,8 +6011,8 @@
         <w:t xml:space="preserve">. https://www.ers.usda.gov/data-products/rural-urban-commuting-area-codes/users-guide.</w:t>
       </w:r>
     </w:p>
-    <w:bookmarkEnd w:id="80"/>
-    <w:bookmarkStart w:id="82" w:name="ref-epsteinPredictionStressDrug2020"/>
+    <w:bookmarkEnd w:id="83"/>
+    <w:bookmarkStart w:id="85" w:name="ref-epsteinPredictionStressDrug2020"/>
     <w:p>
       <w:pPr>
         <w:pStyle w:val="Bibliography"/>
@@ -6025,7 +6061,7 @@
       <w:r>
         <w:t xml:space="preserve"> </w:t>
       </w:r>
-      <w:hyperlink r:id="rId81">
+      <w:hyperlink r:id="rId84">
         <w:r>
           <w:rPr>
             <w:rStyle w:val="Hyperlink"/>
@@ -6034,8 +6070,8 @@
         </w:r>
       </w:hyperlink>
     </w:p>
-    <w:bookmarkEnd w:id="82"/>
-    <w:bookmarkStart w:id="84" w:name="ref-florenceEconomicBurdenOpioid2021"/>
+    <w:bookmarkEnd w:id="85"/>
+    <w:bookmarkStart w:id="87" w:name="ref-florenceEconomicBurdenOpioid2021"/>
     <w:p>
       <w:pPr>
         <w:pStyle w:val="Bibliography"/>
@@ -6081,7 +6117,7 @@
       <w:r>
         <w:t xml:space="preserve"> </w:t>
       </w:r>
-      <w:hyperlink r:id="rId83">
+      <w:hyperlink r:id="rId86">
         <w:r>
           <w:rPr>
             <w:rStyle w:val="Hyperlink"/>
@@ -6090,8 +6126,8 @@
         </w:r>
       </w:hyperlink>
     </w:p>
-    <w:bookmarkEnd w:id="84"/>
-    <w:bookmarkStart w:id="85" w:name="ref-goodrichRstanarmBayesianApplied2023"/>
+    <w:bookmarkEnd w:id="87"/>
+    <w:bookmarkStart w:id="88" w:name="ref-goodrichRstanarmBayesianApplied2023"/>
     <w:p>
       <w:pPr>
         <w:pStyle w:val="Bibliography"/>
@@ -6155,8 +6191,8 @@
         <w:t xml:space="preserve">.</w:t>
       </w:r>
     </w:p>
-    <w:bookmarkEnd w:id="85"/>
-    <w:bookmarkStart w:id="87" w:name="Xa203ab3abd150ead1a7854a9fa5726c8a273f52"/>
+    <w:bookmarkEnd w:id="88"/>
+    <w:bookmarkStart w:id="90" w:name="Xa203ab3abd150ead1a7854a9fa5726c8a273f52"/>
     <w:p>
       <w:pPr>
         <w:pStyle w:val="Bibliography"/>
@@ -6205,7 +6241,7 @@
       <w:r>
         <w:t xml:space="preserve"> </w:t>
       </w:r>
-      <w:hyperlink r:id="rId86">
+      <w:hyperlink r:id="rId89">
         <w:r>
           <w:rPr>
             <w:rStyle w:val="Hyperlink"/>
@@ -6214,8 +6250,8 @@
         </w:r>
       </w:hyperlink>
     </w:p>
-    <w:bookmarkEnd w:id="87"/>
-    <w:bookmarkStart w:id="89" w:name="X805b64c6cb0e2e29672f0738918e5324c4e18a1"/>
+    <w:bookmarkEnd w:id="90"/>
+    <w:bookmarkStart w:id="92" w:name="X805b64c6cb0e2e29672f0738918e5324c4e18a1"/>
     <w:p>
       <w:pPr>
         <w:pStyle w:val="Bibliography"/>
@@ -6252,7 +6288,7 @@
       <w:r>
         <w:t xml:space="preserve"> </w:t>
       </w:r>
-      <w:hyperlink r:id="rId88">
+      <w:hyperlink r:id="rId91">
         <w:r>
           <w:rPr>
             <w:rStyle w:val="Hyperlink"/>
@@ -6261,8 +6297,8 @@
         </w:r>
       </w:hyperlink>
     </w:p>
-    <w:bookmarkEnd w:id="89"/>
-    <w:bookmarkStart w:id="90" w:name="X8b12ef138ca23b48f269e0b446537ae876fd725"/>
+    <w:bookmarkEnd w:id="92"/>
+    <w:bookmarkStart w:id="93" w:name="X8b12ef138ca23b48f269e0b446537ae876fd725"/>
     <w:p>
       <w:pPr>
         <w:pStyle w:val="Bibliography"/>
@@ -6298,8 +6334,8 @@
         <w:t xml:space="preserve">. https://www.hrsa.gov/rural-health/about-us/what-is-rural.</w:t>
       </w:r>
     </w:p>
-    <w:bookmarkEnd w:id="90"/>
-    <w:bookmarkStart w:id="92" w:name="X124ba946b4d19c4d3454f7989a2955eb824b98a"/>
+    <w:bookmarkEnd w:id="93"/>
+    <w:bookmarkStart w:id="95" w:name="X124ba946b4d19c4d3454f7989a2955eb824b98a"/>
     <w:p>
       <w:pPr>
         <w:pStyle w:val="Bibliography"/>
@@ -6336,7 +6372,7 @@
       <w:r>
         <w:t xml:space="preserve"> </w:t>
       </w:r>
-      <w:hyperlink r:id="rId91">
+      <w:hyperlink r:id="rId94">
         <w:r>
           <w:rPr>
             <w:rStyle w:val="Hyperlink"/>
@@ -6345,8 +6381,8 @@
         </w:r>
       </w:hyperlink>
     </w:p>
-    <w:bookmarkEnd w:id="92"/>
-    <w:bookmarkStart w:id="94" w:name="ref-hserHighMortalityPatients2017"/>
+    <w:bookmarkEnd w:id="95"/>
+    <w:bookmarkStart w:id="97" w:name="ref-hserHighMortalityPatients2017"/>
     <w:p>
       <w:pPr>
         <w:pStyle w:val="Bibliography"/>
@@ -6404,7 +6440,7 @@
       <w:r>
         <w:t xml:space="preserve"> </w:t>
       </w:r>
-      <w:hyperlink r:id="rId93">
+      <w:hyperlink r:id="rId96">
         <w:r>
           <w:rPr>
             <w:rStyle w:val="Hyperlink"/>
@@ -6413,8 +6449,8 @@
         </w:r>
       </w:hyperlink>
     </w:p>
-    <w:bookmarkEnd w:id="94"/>
-    <w:bookmarkStart w:id="96" w:name="X9dfa929848d202736296032659cec14e42606bb"/>
+    <w:bookmarkEnd w:id="97"/>
+    <w:bookmarkStart w:id="99" w:name="X9dfa929848d202736296032659cec14e42606bb"/>
     <w:p>
       <w:pPr>
         <w:pStyle w:val="Bibliography"/>
@@ -6451,7 +6487,7 @@
       <w:r>
         <w:t xml:space="preserve"> </w:t>
       </w:r>
-      <w:hyperlink r:id="rId95">
+      <w:hyperlink r:id="rId98">
         <w:r>
           <w:rPr>
             <w:rStyle w:val="Hyperlink"/>
@@ -6460,8 +6496,8 @@
         </w:r>
       </w:hyperlink>
     </w:p>
-    <w:bookmarkEnd w:id="96"/>
-    <w:bookmarkStart w:id="98" w:name="ref-kilaruIncidenceTreatmentOpioid2020"/>
+    <w:bookmarkEnd w:id="99"/>
+    <w:bookmarkStart w:id="101" w:name="ref-kilaruIncidenceTreatmentOpioid2020"/>
     <w:p>
       <w:pPr>
         <w:pStyle w:val="Bibliography"/>
@@ -6531,7 +6567,7 @@
       <w:r>
         <w:t xml:space="preserve"> </w:t>
       </w:r>
-      <w:hyperlink r:id="rId97">
+      <w:hyperlink r:id="rId100">
         <w:r>
           <w:rPr>
             <w:rStyle w:val="Hyperlink"/>
@@ -6540,8 +6576,8 @@
         </w:r>
       </w:hyperlink>
     </w:p>
-    <w:bookmarkEnd w:id="98"/>
-    <w:bookmarkStart w:id="99" w:name="Xa93a98d1ce255982a5ea923c39451c32053b2a2"/>
+    <w:bookmarkEnd w:id="101"/>
+    <w:bookmarkStart w:id="102" w:name="Xa93a98d1ce255982a5ea923c39451c32053b2a2"/>
     <w:p>
       <w:pPr>
         <w:pStyle w:val="Bibliography"/>
@@ -6633,8 +6669,8 @@
         <w:t xml:space="preserve">.</w:t>
       </w:r>
     </w:p>
-    <w:bookmarkEnd w:id="99"/>
-    <w:bookmarkStart w:id="100" w:name="ref-kuhnTidymodelsCollectionPackages2020"/>
+    <w:bookmarkEnd w:id="102"/>
+    <w:bookmarkStart w:id="103" w:name="ref-kuhnTidymodelsCollectionPackages2020"/>
     <w:p>
       <w:pPr>
         <w:pStyle w:val="Bibliography"/>
@@ -6656,8 +6692,8 @@
         <w:t xml:space="preserve">.</w:t>
       </w:r>
     </w:p>
-    <w:bookmarkEnd w:id="100"/>
-    <w:bookmarkStart w:id="102" w:name="ref-lofaroRuralUrbanDifferences2025"/>
+    <w:bookmarkEnd w:id="103"/>
+    <w:bookmarkStart w:id="105" w:name="ref-lofaroRuralUrbanDifferences2025"/>
     <w:p>
       <w:pPr>
         <w:pStyle w:val="Bibliography"/>
@@ -6694,7 +6730,7 @@
       <w:r>
         <w:t xml:space="preserve"> </w:t>
       </w:r>
-      <w:hyperlink r:id="rId101">
+      <w:hyperlink r:id="rId104">
         <w:r>
           <w:rPr>
             <w:rStyle w:val="Hyperlink"/>
@@ -6703,8 +6739,8 @@
         </w:r>
       </w:hyperlink>
     </w:p>
-    <w:bookmarkEnd w:id="102"/>
-    <w:bookmarkStart w:id="103" w:name="X34be55f2a2ff67a14e7206627bb93b426490c87"/>
+    <w:bookmarkEnd w:id="105"/>
+    <w:bookmarkStart w:id="106" w:name="X34be55f2a2ff67a14e7206627bb93b426490c87"/>
     <w:p>
       <w:pPr>
         <w:pStyle w:val="Bibliography"/>
@@ -6796,8 +6832,8 @@
         <w:t xml:space="preserve">, 4768–4777.</w:t>
       </w:r>
     </w:p>
-    <w:bookmarkEnd w:id="103"/>
-    <w:bookmarkStart w:id="105" w:name="Xcd5b1eed29ae982ceb2faccc95458d58289f03d"/>
+    <w:bookmarkEnd w:id="106"/>
+    <w:bookmarkStart w:id="108" w:name="Xcd5b1eed29ae982ceb2faccc95458d58289f03d"/>
     <w:p>
       <w:pPr>
         <w:pStyle w:val="Bibliography"/>
@@ -6834,7 +6870,7 @@
       <w:r>
         <w:t xml:space="preserve"> </w:t>
       </w:r>
-      <w:hyperlink r:id="rId104">
+      <w:hyperlink r:id="rId107">
         <w:r>
           <w:rPr>
             <w:rStyle w:val="Hyperlink"/>
@@ -6843,13 +6879,99 @@
         </w:r>
       </w:hyperlink>
     </w:p>
-    <w:bookmarkEnd w:id="105"/>
-    <w:bookmarkStart w:id="107" w:name="ref-mohrPersonalSensingUnderstanding2017"/>
+    <w:bookmarkEnd w:id="108"/>
+    <w:bookmarkStart w:id="110" w:name="ref-martinNeedReceiptSubstance2022"/>
     <w:p>
       <w:pPr>
         <w:pStyle w:val="Bibliography"/>
       </w:pPr>
       <w:r>
+        <w:t xml:space="preserve">Martin, C. E., Parlier-Ahmad, A. B., Beck, L., Scialli, A., &amp; Terplan, M. (2022). Need for and</w:t>
+      </w:r>
+      <w:r>
+        <w:t xml:space="preserve"> </w:t>
+      </w:r>
+      <w:r>
+        <w:t xml:space="preserve">Receipt</w:t>
+      </w:r>
+      <w:r>
+        <w:t xml:space="preserve"> </w:t>
+      </w:r>
+      <w:r>
+        <w:t xml:space="preserve">of</w:t>
+      </w:r>
+      <w:r>
+        <w:t xml:space="preserve"> </w:t>
+      </w:r>
+      <w:r>
+        <w:t xml:space="preserve">Substance Use Disorder Treatment Among Adults</w:t>
+      </w:r>
+      <w:r>
+        <w:t xml:space="preserve">, by</w:t>
+      </w:r>
+      <w:r>
+        <w:t xml:space="preserve"> </w:t>
+      </w:r>
+      <w:r>
+        <w:t xml:space="preserve">Gender</w:t>
+      </w:r>
+      <w:r>
+        <w:t xml:space="preserve">, in the</w:t>
+      </w:r>
+      <w:r>
+        <w:t xml:space="preserve"> </w:t>
+      </w:r>
+      <w:r>
+        <w:t xml:space="preserve">United States</w:t>
+      </w:r>
+      <w:r>
+        <w:t xml:space="preserve">.</w:t>
+      </w:r>
+      <w:r>
+        <w:t xml:space="preserve"> </w:t>
+      </w:r>
+      <w:r>
+        <w:rPr>
+          <w:i/>
+          <w:iCs/>
+        </w:rPr>
+        <w:t xml:space="preserve">Public Health Reports</w:t>
+      </w:r>
+      <w:r>
+        <w:t xml:space="preserve">,</w:t>
+      </w:r>
+      <w:r>
+        <w:t xml:space="preserve"> </w:t>
+      </w:r>
+      <w:r>
+        <w:rPr>
+          <w:i/>
+          <w:iCs/>
+        </w:rPr>
+        <w:t xml:space="preserve">137</w:t>
+      </w:r>
+      <w:r>
+        <w:t xml:space="preserve">(5), 955–963.</w:t>
+      </w:r>
+      <w:r>
+        <w:t xml:space="preserve"> </w:t>
+      </w:r>
+      <w:hyperlink r:id="rId109">
+        <w:r>
+          <w:rPr>
+            <w:rStyle w:val="Hyperlink"/>
+          </w:rPr>
+          <w:t xml:space="preserve">https://doi.org/10.1177/00333549211041554</w:t>
+        </w:r>
+      </w:hyperlink>
+    </w:p>
+    <w:bookmarkEnd w:id="110"/>
+    <w:bookmarkStart w:id="112" w:name="ref-mohrPersonalSensingUnderstanding2017"/>
+    <w:p>
+      <w:pPr>
+        <w:pStyle w:val="Bibliography"/>
+      </w:pPr>
+      <w:r>
         <w:t xml:space="preserve">Mohr, D. C., Zhang, M., &amp; Schueller, S. M. (2017). Personal</w:t>
       </w:r>
       <w:r>
@@ -6911,7 +7033,7 @@
       <w:r>
         <w:t xml:space="preserve"> </w:t>
       </w:r>
-      <w:hyperlink r:id="rId106">
+      <w:hyperlink r:id="rId111">
         <w:r>
           <w:rPr>
             <w:rStyle w:val="Hyperlink"/>
@@ -6920,8 +7042,8 @@
         </w:r>
       </w:hyperlink>
     </w:p>
-    <w:bookmarkEnd w:id="107"/>
-    <w:bookmarkStart w:id="108" w:name="X0c0e928dd8ff101aa479012bffab8d24e8c0dcf"/>
+    <w:bookmarkEnd w:id="112"/>
+    <w:bookmarkStart w:id="113" w:name="X0c0e928dd8ff101aa479012bffab8d24e8c0dcf"/>
     <w:p>
       <w:pPr>
         <w:pStyle w:val="Bibliography"/>
@@ -6978,8 +7100,8 @@
         <w:t xml:space="preserve">. Independently published.</w:t>
       </w:r>
     </w:p>
-    <w:bookmarkEnd w:id="108"/>
-    <w:bookmarkStart w:id="110" w:name="X1f44e09282148d362bdacfce67d6a56b1cf06db"/>
+    <w:bookmarkEnd w:id="113"/>
+    <w:bookmarkStart w:id="115" w:name="X1f44e09282148d362bdacfce67d6a56b1cf06db"/>
     <w:p>
       <w:pPr>
         <w:pStyle w:val="Bibliography"/>
@@ -7070,7 +7192,7 @@
       <w:r>
         <w:t xml:space="preserve"> </w:t>
       </w:r>
-      <w:hyperlink r:id="rId109">
+      <w:hyperlink r:id="rId114">
         <w:r>
           <w:rPr>
             <w:rStyle w:val="Hyperlink"/>
@@ -7079,8 +7201,8 @@
         </w:r>
       </w:hyperlink>
     </w:p>
-    <w:bookmarkEnd w:id="110"/>
-    <w:bookmarkStart w:id="112" w:name="ref-olfsonHealthcareCoverageService2022"/>
+    <w:bookmarkEnd w:id="115"/>
+    <w:bookmarkStart w:id="117" w:name="ref-olfsonHealthcareCoverageService2022"/>
     <w:p>
       <w:pPr>
         <w:pStyle w:val="Bibliography"/>
@@ -7117,7 +7239,7 @@
       <w:r>
         <w:t xml:space="preserve"> </w:t>
       </w:r>
-      <w:hyperlink r:id="rId111">
+      <w:hyperlink r:id="rId116">
         <w:r>
           <w:rPr>
             <w:rStyle w:val="Hyperlink"/>
@@ -7126,8 +7248,8 @@
         </w:r>
       </w:hyperlink>
     </w:p>
-    <w:bookmarkEnd w:id="112"/>
-    <w:bookmarkStart w:id="114" w:name="ref-pinedoCurrentReexaminationRacial2019"/>
+    <w:bookmarkEnd w:id="117"/>
+    <w:bookmarkStart w:id="119" w:name="ref-pinedoCurrentReexaminationRacial2019"/>
     <w:p>
       <w:pPr>
         <w:pStyle w:val="Bibliography"/>
@@ -7176,7 +7298,7 @@
       <w:r>
         <w:t xml:space="preserve"> </w:t>
       </w:r>
-      <w:hyperlink r:id="rId113">
+      <w:hyperlink r:id="rId118">
         <w:r>
           <w:rPr>
             <w:rStyle w:val="Hyperlink"/>
@@ -7185,13 +7307,39 @@
         </w:r>
       </w:hyperlink>
     </w:p>
-    <w:bookmarkEnd w:id="114"/>
-    <w:bookmarkStart w:id="115" w:name="X28b8f85e424928e66706a578d6053e0308d1105"/>
+    <w:bookmarkEnd w:id="119"/>
+    <w:bookmarkStart w:id="120" w:name="ref-plattProbabilisticOutputsSupport1999"/>
     <w:p>
       <w:pPr>
         <w:pStyle w:val="Bibliography"/>
       </w:pPr>
       <w:r>
+        <w:t xml:space="preserve">Platt, J. (1999). Probabilistic outputs for support vector machines and comparisons to regularized likelihood methods. In</w:t>
+      </w:r>
+      <w:r>
+        <w:t xml:space="preserve"> </w:t>
+      </w:r>
+      <w:r>
+        <w:rPr>
+          <w:i/>
+          <w:iCs/>
+        </w:rPr>
+        <w:t xml:space="preserve">Advances in large margin classifiers</w:t>
+      </w:r>
+      <w:r>
+        <w:t xml:space="preserve"> </w:t>
+      </w:r>
+      <w:r>
+        <w:t xml:space="preserve">(pp. 61–74). MIT Press.</w:t>
+      </w:r>
+    </w:p>
+    <w:bookmarkEnd w:id="120"/>
+    <w:bookmarkStart w:id="121" w:name="X28b8f85e424928e66706a578d6053e0308d1105"/>
+    <w:p>
+      <w:pPr>
+        <w:pStyle w:val="Bibliography"/>
+      </w:pPr>
+      <w:r>
         <w:t xml:space="preserve">Substance Abuse and Mental Health Services Administration. (n.d.).</w:t>
       </w:r>
       <w:r>
@@ -7243,8 +7391,8 @@
         <w:t xml:space="preserve">. https://www.samhsa.gov/data/report/2024-nsduh-detailed-tables.</w:t>
       </w:r>
     </w:p>
-    <w:bookmarkEnd w:id="115"/>
-    <w:bookmarkStart w:id="117" w:name="X52c4c4b564080b2dbcc4b68874ef8a36e7b0a07"/>
+    <w:bookmarkEnd w:id="121"/>
+    <w:bookmarkStart w:id="123" w:name="X52c4c4b564080b2dbcc4b68874ef8a36e7b0a07"/>
     <w:p>
       <w:pPr>
         <w:pStyle w:val="Bibliography"/>
@@ -7268,7 +7416,7 @@
       <w:r>
         <w:t xml:space="preserve"> </w:t>
       </w:r>
-      <w:hyperlink r:id="rId116">
+      <w:hyperlink r:id="rId122">
         <w:r>
           <w:rPr>
             <w:rStyle w:val="Hyperlink"/>
@@ -7277,13 +7425,60 @@
         </w:r>
       </w:hyperlink>
     </w:p>
-    <w:bookmarkEnd w:id="117"/>
-    <w:bookmarkStart w:id="119" w:name="ref-weinsteinLongtermRetentionOffice2017"/>
+    <w:bookmarkEnd w:id="123"/>
+    <w:bookmarkStart w:id="125" w:name="X6ee708186a5d814f6044b48499818110320664f"/>
     <w:p>
       <w:pPr>
         <w:pStyle w:val="Bibliography"/>
       </w:pPr>
       <w:r>
+        <w:t xml:space="preserve">Vandewiele, G., Dehaene, I., Kovács, G., Sterckx, L., Janssens, O., Ongenae, F., De Backere, F., De Turck, F., Roelens, K., Decruyenaere, J., Van Hoecke, S., &amp; Demeester, T. (2021). Overly optimistic prediction results on imbalanced data: A case study of flaws and benefits when applying over-sampling.</w:t>
+      </w:r>
+      <w:r>
+        <w:t xml:space="preserve"> </w:t>
+      </w:r>
+      <w:r>
+        <w:rPr>
+          <w:i/>
+          <w:iCs/>
+        </w:rPr>
+        <w:t xml:space="preserve">Artificial Intelligence in Medicine</w:t>
+      </w:r>
+      <w:r>
+        <w:t xml:space="preserve">,</w:t>
+      </w:r>
+      <w:r>
+        <w:t xml:space="preserve"> </w:t>
+      </w:r>
+      <w:r>
+        <w:rPr>
+          <w:i/>
+          <w:iCs/>
+        </w:rPr>
+        <w:t xml:space="preserve">111</w:t>
+      </w:r>
+      <w:r>
+        <w:t xml:space="preserve">, 101987.</w:t>
+      </w:r>
+      <w:r>
+        <w:t xml:space="preserve"> </w:t>
+      </w:r>
+      <w:hyperlink r:id="rId124">
+        <w:r>
+          <w:rPr>
+            <w:rStyle w:val="Hyperlink"/>
+          </w:rPr>
+          <w:t xml:space="preserve">https://doi.org/10.1016/j.artmed.2020.101987</w:t>
+        </w:r>
+      </w:hyperlink>
+    </w:p>
+    <w:bookmarkEnd w:id="125"/>
+    <w:bookmarkStart w:id="127" w:name="ref-weinsteinLongtermRetentionOffice2017"/>
+    <w:p>
+      <w:pPr>
+        <w:pStyle w:val="Bibliography"/>
+      </w:pPr>
+      <w:r>
         <w:t xml:space="preserve">Weinstein, Z. M., Kim, H. W., Cheng, D. M., Quinn, E., Hui, D., Labelle, C. T., Drainoni, M.-L., Bachman, S. S., &amp; Samet, J. H. (2017). Long-term retention in</w:t>
       </w:r>
       <w:r>
@@ -7327,7 +7522,7 @@
       <w:r>
         <w:t xml:space="preserve"> </w:t>
       </w:r>
-      <w:hyperlink r:id="rId118">
+      <w:hyperlink r:id="rId126">
         <w:r>
           <w:rPr>
             <w:rStyle w:val="Hyperlink"/>
@@ -7336,8 +7531,8 @@
         </w:r>
       </w:hyperlink>
     </w:p>
-    <w:bookmarkEnd w:id="119"/>
-    <w:bookmarkStart w:id="121" w:name="Xb35ee182d565575e339a0170868456c1684f821"/>
+    <w:bookmarkEnd w:id="127"/>
+    <w:bookmarkStart w:id="129" w:name="Xb35ee182d565575e339a0170868456c1684f821"/>
     <w:p>
       <w:pPr>
         <w:pStyle w:val="Bibliography"/>
@@ -7392,7 +7587,7 @@
       <w:r>
         <w:t xml:space="preserve"> </w:t>
       </w:r>
-      <w:hyperlink r:id="rId120">
+      <w:hyperlink r:id="rId128">
         <w:r>
           <w:rPr>
             <w:rStyle w:val="Hyperlink"/>
@@ -7401,8 +7596,8 @@
         </w:r>
       </w:hyperlink>
     </w:p>
-    <w:bookmarkEnd w:id="121"/>
-    <w:bookmarkStart w:id="123" w:name="ref-wyantMachineLearningModels2024"/>
+    <w:bookmarkEnd w:id="129"/>
+    <w:bookmarkStart w:id="131" w:name="ref-wyantMachineLearningModels2024"/>
     <w:p>
       <w:pPr>
         <w:pStyle w:val="Bibliography"/>
@@ -7426,7 +7621,7 @@
       <w:r>
         <w:t xml:space="preserve"> </w:t>
       </w:r>
-      <w:hyperlink r:id="rId122">
+      <w:hyperlink r:id="rId130">
         <w:r>
           <w:rPr>
             <w:rStyle w:val="Hyperlink"/>
@@ -7435,9 +7630,83 @@
         </w:r>
       </w:hyperlink>
     </w:p>
-    <w:bookmarkEnd w:id="123"/>
-    <w:bookmarkEnd w:id="124"/>
-    <w:bookmarkEnd w:id="125"/>
+    <w:bookmarkEnd w:id="131"/>
+    <w:bookmarkStart w:id="133" w:name="X919c097397142f85d541b216884b2f657258800"/>
+    <w:p>
+      <w:pPr>
+        <w:pStyle w:val="Bibliography"/>
+      </w:pPr>
+      <w:r>
+        <w:t xml:space="preserve">Xin, Y., Schwarting, C. M., Wasef, M. R., &amp; Davis, A. K. (2023). Exploring the intersectionality of stigma and substance use help-seeking behaviours among lesbian, gay, bisexual, transgender, queer, questioning or otherwise gender or sexuality minority (</w:t>
+      </w:r>
+      <w:r>
+        <w:t xml:space="preserve">LGBTQ</w:t>
+      </w:r>
+      <w:r>
+        <w:t xml:space="preserve">+) individuals in the</w:t>
+      </w:r>
+      <w:r>
+        <w:t xml:space="preserve"> </w:t>
+      </w:r>
+      <w:r>
+        <w:t xml:space="preserve">United States</w:t>
+      </w:r>
+      <w:r>
+        <w:t xml:space="preserve">:</w:t>
+      </w:r>
+      <w:r>
+        <w:t xml:space="preserve"> </w:t>
+      </w:r>
+      <w:r>
+        <w:t xml:space="preserve">A</w:t>
+      </w:r>
+      <w:r>
+        <w:t xml:space="preserve"> </w:t>
+      </w:r>
+      <w:r>
+        <w:t xml:space="preserve">scoping review.</w:t>
+      </w:r>
+      <w:r>
+        <w:t xml:space="preserve"> </w:t>
+      </w:r>
+      <w:r>
+        <w:rPr>
+          <w:i/>
+          <w:iCs/>
+        </w:rPr>
+        <w:t xml:space="preserve">Global Public Health</w:t>
+      </w:r>
+      <w:r>
+        <w:t xml:space="preserve">,</w:t>
+      </w:r>
+      <w:r>
+        <w:t xml:space="preserve"> </w:t>
+      </w:r>
+      <w:r>
+        <w:rPr>
+          <w:i/>
+          <w:iCs/>
+        </w:rPr>
+        <w:t xml:space="preserve">18</w:t>
+      </w:r>
+      <w:r>
+        <w:t xml:space="preserve">(1), 2277854.</w:t>
+      </w:r>
+      <w:r>
+        <w:t xml:space="preserve"> </w:t>
+      </w:r>
+      <w:hyperlink r:id="rId132">
+        <w:r>
+          <w:rPr>
+            <w:rStyle w:val="Hyperlink"/>
+          </w:rPr>
+          <w:t xml:space="preserve">https://doi.org/10.1080/17441692.2023.2277854</w:t>
+        </w:r>
+      </w:hyperlink>
+    </w:p>
+    <w:bookmarkEnd w:id="133"/>
+    <w:bookmarkEnd w:id="134"/>
+    <w:bookmarkEnd w:id="135"/>
     <w:sectPr/>
   </w:body>
 </w:document>

</xml_diff>

<commit_message>
remove dem calibration plots in supplemnt
</commit_message>
<xml_diff>
--- a/_manuscript/index.docx
+++ b/_manuscript/index.docx
@@ -5687,7 +5687,7 @@
     </w:p>
     <w:bookmarkEnd w:id="64"/>
     <w:bookmarkEnd w:id="65"/>
-    <w:bookmarkStart w:id="72" w:name="discussion"/>
+    <w:bookmarkStart w:id="71" w:name="discussion"/>
     <w:p>
       <w:pPr>
         <w:pStyle w:val="Heading1"/>
@@ -5718,7 +5718,41 @@
         <w:pStyle w:val="BodyText"/>
       </w:pPr>
       <w:r>
-        <w:t xml:space="preserve">We were excited to see that fairness discrepancies in model performance were minimal. In all subgroups, our model had a median auROC above 0.90, which is generally considered to be a benchmark of excellent performance. Nevertheless, differences of 0.02 - 0.03 (favoring the advantaged group) were present in race and ethnicity, sexual orientation, and geographic location comparisons. These group comparisons were the most imbalanced, with 19-29% of participants in the disadvantaged groups. Our model may perform better for these groups with greater representation in the training data. Future research into identifying additional risk factors for lapse that are more prevalent in these groups may also help to reduce these discrepancies.</w:t>
+        <w:t xml:space="preserve">We were excited to see that fairness discrepancies in model performance were minimal. In all subgroups, our model had a median auROC above 0.90, which is generally considered to be a benchmark of excellent performance. Nevertheless, differences of 0.01 - 0.03 (favoring the advantaged group) were present in gender, race and ethnicity, sexual orientation, and geographic location comparisons. Despite our efforts to recruit a diverse sample, many of these group comparisons remained imbalanced (e.g., 19-29% of participants in the disadvantaged groups for race and ethnicity, sexual orientation, and geographic location). Our model may perform better for these groups with greater representation in the training data. Future models would benefit from increased representation across these groups.</w:t>
+      </w:r>
+    </w:p>
+    <w:p>
+      <w:pPr>
+        <w:pStyle w:val="BodyText"/>
+      </w:pPr>
+      <w:r>
+        <w:t xml:space="preserve">Future research should also purposefully recruit participants across a wider age range. Older adults (65+ years) are less likely to receive substance use disorder treatment and often report lower levels of social interaction and support than younger adults</w:t>
+      </w:r>
+      <w:r>
+        <w:t xml:space="preserve"> </w:t>
+      </w:r>
+      <w:r>
+        <w:t xml:space="preserve">(Choi et al., 2014; Kilaru et al., 2020)</w:t>
+      </w:r>
+      <w:r>
+        <w:t xml:space="preserve">. They may also be less comfortable with, or less able to provide, smartphone sensing data at the level of adherence needed for accurate prediction. We did not explicitly evaluate model fairness for this subgroup due to limited representation in our sample. We encourage future research to examine model performance for older adults to ensure generalizability.</w:t>
+      </w:r>
+    </w:p>
+    <w:p>
+      <w:pPr>
+        <w:pStyle w:val="BodyText"/>
+      </w:pPr>
+      <w:r>
+        <w:t xml:space="preserve">In addition to representation, it may be that additional risk factors not currently measured could further improve the fairness performance of our models. For example, incorporating lapse risk factors that may be more salient for women (e.g., interpersonal relationship problems, hormonal changes</w:t>
+      </w:r>
+      <w:r>
+        <w:t xml:space="preserve"> </w:t>
+      </w:r>
+      <w:r>
+        <w:t xml:space="preserve">(McHugh et al., 2018; Walitzer &amp; Dearing, 2006)</w:t>
+      </w:r>
+      <w:r>
+        <w:t xml:space="preserve">) and other underrepresented groups may help reduce performance disparities by adding features more salient for predicting lapse for certain subgroups.</w:t>
       </w:r>
     </w:p>
     <w:bookmarkEnd w:id="66"/>
@@ -5838,13 +5872,13 @@
       </w:r>
     </w:p>
     <w:bookmarkEnd w:id="68"/>
-    <w:bookmarkStart w:id="69" w:name="model-fairness"/>
+    <w:bookmarkStart w:id="69" w:name="X40ab624ebf83813907a18dba36edd4d1d14a553"/>
     <w:p>
       <w:pPr>
         <w:pStyle w:val="Heading2"/>
       </w:pPr>
       <w:r>
-        <w:t xml:space="preserve">Model Fairness</w:t>
+        <w:t xml:space="preserve">Additional Limitations and Future Directions</w:t>
       </w:r>
     </w:p>
     <w:p>
@@ -5852,16 +5886,7 @@
         <w:pStyle w:val="FirstParagraph"/>
       </w:pPr>
       <w:r>
-        <w:t xml:space="preserve">It may be that additional risk factors not currently measured could further improve the fairness performance of our models. For example, incorporating lapse risk factors that may be more salient for women (e.g., interpersonal relationship problems, hormonal changes</w:t>
-      </w:r>
-      <w:r>
-        <w:t xml:space="preserve"> </w:t>
-      </w:r>
-      <w:r>
-        <w:t xml:space="preserve">(McHugh et al., 2018; Walitzer &amp; Dearing, 2006)</w:t>
-      </w:r>
-      <w:r>
-        <w:t xml:space="preserve">) and other underrepresented groups could help reduce performance disparities. Additionally, a broader set of features may enable more personalized and variable risk feedback. At the same time, the increased burden associated with additional survey items must be carefully weighed.</w:t>
+        <w:t xml:space="preserve">Other characteristics of our sample may limit the generalizability of our findings. One obvious limitation is the research context in which participants provided these data. Participants were modestly compensated for completing daily surveys and providing geolocation data, which may have influenced their willingness to provide these data. However, participants received no additional direct benefit beyond financial compensation. In real-world implementations, individuals may be more motivated to share data if doing so enables personalized recovery support.</w:t>
       </w:r>
     </w:p>
     <w:p>
@@ -5869,26 +5894,70 @@
         <w:pStyle w:val="BodyText"/>
       </w:pPr>
       <w:r>
-        <w:t xml:space="preserve">Future models would benefit from increased representation across race and ethnicity, sexual orientation, and geographic location. Future research should also purposefully recruit participants across a wider age range. Older adults (65+ years) are less likely to receive substance use disorder treatment and often report lower levels of social interaction and support than younger adults</w:t>
-      </w:r>
-      <w:r>
-        <w:t xml:space="preserve"> </w:t>
-      </w:r>
-      <w:r>
-        <w:t xml:space="preserve">(Choi et al., 2014; Kilaru et al., 2020)</w:t>
-      </w:r>
-      <w:r>
-        <w:t xml:space="preserve">. They may also be less comfortable with, or less able to provide, smartphone sensing data at the level of adherence needed for accurate prediction. We did not explicitly evaluate model fairness for this subgroup due to limited representation in our sample. We encourage future research to examine model performance for older adults to ensure generalizability.</w:t>
+        <w:t xml:space="preserve">Second, we implemented daily survey compliance thresholds to exclude participants and adjust study end dates. This criterion was important because we generated our lapse labels from the daily survey data and thus we required consistent collection of this data stream for accurate observation labels. As a result, our estimates of adherence and model performance may be slightly optimistic. Still, even with this criterion, nearly 78% of participants remained in the study for at least six months, suggesting that long-term monitoring with daily surveys is feasible for a substantial proportion of individuals in this population.</w:t>
+      </w:r>
+    </w:p>
+    <w:p>
+      <w:pPr>
+        <w:pStyle w:val="BodyText"/>
+      </w:pPr>
+      <w:r>
+        <w:t xml:space="preserve">A third limitation is that our sample was restricted to individuals with a goal of abstinence. Accordingly, our models were trained to predict goal-inconsistent use (i.e., lapse), which may limit their applicability to individuals with alternative recovery goals. Although we see no inherent reason these models could not be adapted for individuals pursuing moderation or harm reduction, this remains an empirical question. For individuals who do not aim to abstain, the definition of goal-inconsistent use is less straightforward and may vary considerably from person to person. Future studies could improve generalizability by allowing individuals to self-define goal-inconsistent use (e.g., mixing opioids with other substances or using larger amounts than planned) and train models in samples with diverse recovery goals.</w:t>
+      </w:r>
+    </w:p>
+    <w:p>
+      <w:pPr>
+        <w:pStyle w:val="BodyText"/>
+      </w:pPr>
+      <w:r>
+        <w:t xml:space="preserve">Fourth we explicitly recruited participants who were early in their recovery (defined by time abstinent). Thus, it is possible that our models more accurately represent relationships between risk factors and lapse among individuals in early recovery. As individuals progress in their recovery, the relative importance of different risk factors may change. For example, craving may be more important for lapse risk during early recovery, whereas pleasant events and location variance may become more important during extended recovery.</w:t>
+      </w:r>
+    </w:p>
+    <w:p>
+      <w:pPr>
+        <w:pStyle w:val="BodyText"/>
+      </w:pPr>
+      <w:r>
+        <w:t xml:space="preserve">Given that our participants remained in the study for up to one year. We may be able to test whether the accuracy of our model’s predictions or the magnitude of a feature’s contribution to those predictions, changes as a function of time in recovery in future work. For example, we could include a time-varying recovery feature, such as days since the most recent quit date or days since the last treatment episode, in our model. Because our best-performing models have been XGBoost, they can natively accommodate interactions between this recovery feature and other predictors. We could then assess whether model performance and the relative ordering of important features differ between the first half and the second half of the study period, providing insight into potential differences in early versus later recovery.</w:t>
+      </w:r>
+    </w:p>
+    <w:p>
+      <w:pPr>
+        <w:pStyle w:val="BodyText"/>
+      </w:pPr>
+      <w:r>
+        <w:t xml:space="preserve">Lastly, there may be value in exploring alternative modeling approaches that better leverage the temporal structure and individual-level nature of these data. For example, hierarchical models that start with population-based information (i.e., priors) and are updated with person-specific information as the individual provides data may be the most promising approach for effective use of time-varying information to model how an individual’s lapse risk evolves over time. Our lab has begun to develop these models and found preliminary evidence to suggest that they may modestly outperform traditional machine learning models for predicting alcohol lapses</w:t>
+      </w:r>
+      <w:r>
+        <w:t xml:space="preserve"> </w:t>
+      </w:r>
+      <w:r>
+        <w:t xml:space="preserve">(Pulick et al., 2025)</w:t>
+      </w:r>
+      <w:r>
+        <w:t xml:space="preserve"> </w:t>
+      </w:r>
+      <w:r>
+        <w:t xml:space="preserve">(but also see</w:t>
+      </w:r>
+      <w:r>
+        <w:t xml:space="preserve"> </w:t>
+      </w:r>
+      <w:r>
+        <w:t xml:space="preserve">Leenaerts et al. (2024)</w:t>
+      </w:r>
+      <w:r>
+        <w:t xml:space="preserve">).</w:t>
       </w:r>
     </w:p>
     <w:bookmarkEnd w:id="69"/>
-    <w:bookmarkStart w:id="70" w:name="X40ab624ebf83813907a18dba36edd4d1d14a553"/>
+    <w:bookmarkStart w:id="70" w:name="conclusion"/>
     <w:p>
       <w:pPr>
         <w:pStyle w:val="Heading2"/>
       </w:pPr>
       <w:r>
-        <w:t xml:space="preserve">Additional Limitations and Future Directions</w:t>
+        <w:t xml:space="preserve">Conclusion</w:t>
       </w:r>
     </w:p>
     <w:p>
@@ -5896,143 +5965,64 @@
         <w:pStyle w:val="FirstParagraph"/>
       </w:pPr>
       <w:r>
-        <w:t xml:space="preserve">Other characteristics of our sample may limit the generalizability of our findings. One obvious limitation is the research context in which participants provided these data. Participants were modestly compensated for completing daily surveys and providing geolocation data, which may have influenced their willingness to provide these data. However, participants received no additional direct benefit beyond financial compensation. In real-world implementations, individuals may be more motivated to share data if doing so enables personalized recovery support.</w:t>
-      </w:r>
-    </w:p>
-    <w:p>
-      <w:pPr>
-        <w:pStyle w:val="BodyText"/>
-      </w:pPr>
-      <w:r>
-        <w:t xml:space="preserve">Second, we implemented daily survey compliance thresholds to exclude participants and adjust study end dates. This criterion was important because we generated our lapse labels from the daily survey data and thus we required consistent collection of this data stream for accurate observation labels. As a result, our estimates of adherence and model performance may be slightly optimistic. Still, even with this criterion, nearly 78% of participants remained in the study for at least six months, suggesting that long-term monitoring with daily surveys is feasible for a substantial proportion of individuals in this population.</w:t>
-      </w:r>
-    </w:p>
-    <w:p>
-      <w:pPr>
-        <w:pStyle w:val="BodyText"/>
-      </w:pPr>
-      <w:r>
-        <w:t xml:space="preserve">A third limitation is that our sample was restricted to individuals with a goal of abstinence. Accordingly, our models were trained to predict goal-inconsistent use (i.e., lapse), which may limit their applicability to individuals with alternative recovery goals. Although we see no inherent reason these models could not be adapted for individuals pursuing moderation or harm reduction, this remains an empirical question. For individuals who do not aim to abstain, the definition of goal-inconsistent use is less straightforward and may vary considerably from person to person. Future studies could improve generalizability by allowing individuals to self-define goal-inconsistent use (e.g., mixing opioids with other substances or using larger amounts than planned) and train models in samples with diverse recovery goals.</w:t>
-      </w:r>
-    </w:p>
-    <w:p>
-      <w:pPr>
-        <w:pStyle w:val="BodyText"/>
-      </w:pPr>
-      <w:r>
-        <w:t xml:space="preserve">Fourth we explicitly recruited participants who were early in their recovery (defined by time abstinent). Thus, it is possible that our models more accurately represent relationships between risk factors and lapse among individuals in early recovery. As individuals progress in their recovery, the relative importance of different risk factors may change. For example, craving may be more important for lapse risk during early recovery, whereas pleasant events and location variance may become more important during extended recovery.</w:t>
-      </w:r>
-    </w:p>
-    <w:p>
-      <w:pPr>
-        <w:pStyle w:val="BodyText"/>
-      </w:pPr>
-      <w:r>
-        <w:t xml:space="preserve">Given that our participants remained in the study for up to one year. We may be able to test whether the accuracy of our model’s predictions or the magnitude of a feature’s contribution to those predictions, changes as a function of time in recovery in future work. For example, we could include a time-varying recovery feature, such as days since the most recent quit date or days since the last treatment episode, in our model. Because our best-performing models have been XGBoost, they can natively accommodate interactions between this recovery feature and other predictors. We could then assess whether model performance and the relative ordering of important features differ between the first half and the second half of the study period, providing insight into potential differences in early versus later recovery.</w:t>
-      </w:r>
-    </w:p>
-    <w:p>
-      <w:pPr>
-        <w:pStyle w:val="BodyText"/>
-      </w:pPr>
-      <w:r>
-        <w:t xml:space="preserve">Lastly, there may be value in exploring alternative modeling approaches that better leverage the temporal structure and individual-level nature of these data. For example, hierarchical models that start with population-based information (i.e., priors) and are updated with person-specific information as the individual provides data may be the most promising approach for effective use of time-varying information to model how an individual’s lapse risk evolves over time. Our lab has begun to develop these models and found preliminary evidence to suggest that they may modestly outperform traditional machine learning models for predicting alcohol lapses</w:t>
-      </w:r>
-      <w:r>
-        <w:t xml:space="preserve"> </w:t>
-      </w:r>
-      <w:r>
-        <w:t xml:space="preserve">(Pulick et al., 2025)</w:t>
-      </w:r>
-      <w:r>
-        <w:t xml:space="preserve"> </w:t>
-      </w:r>
-      <w:r>
-        <w:t xml:space="preserve">(but also see</w:t>
-      </w:r>
-      <w:r>
-        <w:t xml:space="preserve"> </w:t>
-      </w:r>
-      <w:r>
-        <w:t xml:space="preserve">Leenaerts et al. (2024)</w:t>
-      </w:r>
-      <w:r>
-        <w:t xml:space="preserve">).</w:t>
+        <w:t xml:space="preserve">In conclusion, it is possible to predict future lapses back to opioid use using smartphone sensing data. Daily surveys and geolocation sensing provide diverse coverage of important risk factors for lapse. Daily recovery recommendations can be mapped onto these factors to deliver support that is personalized to both the person and the moment. While this model was evaluated in a research setting, our use of a national clinical sample of individuals with OUD suggests it represents a promising step toward future real‑world implementation and evaluation.</w:t>
       </w:r>
     </w:p>
     <w:bookmarkEnd w:id="70"/>
-    <w:bookmarkStart w:id="71" w:name="conclusion"/>
-    <w:p>
-      <w:pPr>
-        <w:pStyle w:val="Heading2"/>
-      </w:pPr>
-      <w:r>
-        <w:t xml:space="preserve">Conclusion</w:t>
-      </w:r>
-    </w:p>
-    <w:p>
-      <w:pPr>
-        <w:pStyle w:val="FirstParagraph"/>
-      </w:pPr>
-      <w:r>
-        <w:t xml:space="preserve">In conclusion, it is possible to predict future lapses back to opioid use using smartphone sensing data. Daily surveys and geolocation sensing provide diverse coverage of important risk factors for lapse. Daily recovery recommendations can be mapped onto these factors to deliver support that is personalized to both the person and the moment. While this model was evaluated in a research setting, our use of a national clinical sample of individuals with OUD suggests it represents a promising step toward future real‑world implementation and evaluation.</w:t>
-      </w:r>
-    </w:p>
     <w:bookmarkEnd w:id="71"/>
+    <w:bookmarkStart w:id="159" w:name="references"/>
+    <w:p>
+      <w:pPr>
+        <w:pStyle w:val="Heading1"/>
+      </w:pPr>
+      <w:r>
+        <w:t xml:space="preserve">References</w:t>
+      </w:r>
+    </w:p>
+    <w:bookmarkStart w:id="158" w:name="refs"/>
+    <w:bookmarkStart w:id="72" w:name="Xa6cc3d705527cff91ec886314240e7a8b04e8dd"/>
+    <w:p>
+      <w:pPr>
+        <w:pStyle w:val="Bibliography"/>
+      </w:pPr>
+      <w:r>
+        <w:t xml:space="preserve">American Psychiatric Association. (2022).</w:t>
+      </w:r>
+      <w:r>
+        <w:t xml:space="preserve"> </w:t>
+      </w:r>
+      <w:r>
+        <w:rPr>
+          <w:i/>
+          <w:iCs/>
+        </w:rPr>
+        <w:t xml:space="preserve">Diagnostic and statistical manual of mental disorders :</w:t>
+      </w:r>
+      <w:r>
+        <w:rPr>
+          <w:i/>
+          <w:iCs/>
+        </w:rPr>
+        <w:t xml:space="preserve"> </w:t>
+      </w:r>
+      <w:r>
+        <w:rPr>
+          <w:i/>
+          <w:iCs/>
+        </w:rPr>
+        <w:t xml:space="preserve">DSM-5-TR</w:t>
+      </w:r>
+      <w:r>
+        <w:t xml:space="preserve">. 5th edition, text revision. Washington, DC : American Psychiatric Association Publishing, 2022.</w:t>
+      </w:r>
+    </w:p>
     <w:bookmarkEnd w:id="72"/>
-    <w:bookmarkStart w:id="160" w:name="references"/>
-    <w:p>
-      <w:pPr>
-        <w:pStyle w:val="Heading1"/>
-      </w:pPr>
-      <w:r>
-        <w:t xml:space="preserve">References</w:t>
-      </w:r>
-    </w:p>
-    <w:bookmarkStart w:id="159" w:name="refs"/>
-    <w:bookmarkStart w:id="73" w:name="Xa6cc3d705527cff91ec886314240e7a8b04e8dd"/>
+    <w:bookmarkStart w:id="74" w:name="ref-chtc"/>
     <w:p>
       <w:pPr>
         <w:pStyle w:val="Bibliography"/>
       </w:pPr>
       <w:r>
-        <w:t xml:space="preserve">American Psychiatric Association. (2022).</w:t>
-      </w:r>
-      <w:r>
-        <w:t xml:space="preserve"> </w:t>
-      </w:r>
-      <w:r>
-        <w:rPr>
-          <w:i/>
-          <w:iCs/>
-        </w:rPr>
-        <w:t xml:space="preserve">Diagnostic and statistical manual of mental disorders :</w:t>
-      </w:r>
-      <w:r>
-        <w:rPr>
-          <w:i/>
-          <w:iCs/>
-        </w:rPr>
-        <w:t xml:space="preserve"> </w:t>
-      </w:r>
-      <w:r>
-        <w:rPr>
-          <w:i/>
-          <w:iCs/>
-        </w:rPr>
-        <w:t xml:space="preserve">DSM-5-TR</w:t>
-      </w:r>
-      <w:r>
-        <w:t xml:space="preserve">. 5th edition, text revision. Washington, DC : American Psychiatric Association Publishing, 2022.</w:t>
-      </w:r>
-    </w:p>
-    <w:bookmarkEnd w:id="73"/>
-    <w:bookmarkStart w:id="75" w:name="ref-chtc"/>
-    <w:p>
-      <w:pPr>
-        <w:pStyle w:val="Bibliography"/>
-      </w:pPr>
-      <w:r>
         <w:t xml:space="preserve">Center for High Throughput Computing. (2006).</w:t>
       </w:r>
       <w:r>
@@ -6051,7 +6041,7 @@
       <w:r>
         <w:t xml:space="preserve"> </w:t>
       </w:r>
-      <w:hyperlink r:id="rId74">
+      <w:hyperlink r:id="rId73">
         <w:r>
           <w:rPr>
             <w:rStyle w:val="Hyperlink"/>
@@ -6060,8 +6050,8 @@
         </w:r>
       </w:hyperlink>
     </w:p>
-    <w:bookmarkEnd w:id="75"/>
-    <w:bookmarkStart w:id="77" w:name="ref-choiTreatmentUsePerceived2014"/>
+    <w:bookmarkEnd w:id="74"/>
+    <w:bookmarkStart w:id="76" w:name="ref-choiTreatmentUsePerceived2014"/>
     <w:p>
       <w:pPr>
         <w:pStyle w:val="Bibliography"/>
@@ -6098,7 +6088,7 @@
       <w:r>
         <w:t xml:space="preserve"> </w:t>
       </w:r>
-      <w:hyperlink r:id="rId76">
+      <w:hyperlink r:id="rId75">
         <w:r>
           <w:rPr>
             <w:rStyle w:val="Hyperlink"/>
@@ -6107,8 +6097,8 @@
         </w:r>
       </w:hyperlink>
     </w:p>
-    <w:bookmarkEnd w:id="77"/>
-    <w:bookmarkStart w:id="79" w:name="ref-collinsTRIPODAIStatementUpdated2024"/>
+    <w:bookmarkEnd w:id="76"/>
+    <w:bookmarkStart w:id="78" w:name="ref-collinsTRIPODAIStatementUpdated2024"/>
     <w:p>
       <w:pPr>
         <w:pStyle w:val="Bibliography"/>
@@ -6163,7 +6153,7 @@
       <w:r>
         <w:t xml:space="preserve"> </w:t>
       </w:r>
-      <w:hyperlink r:id="rId78">
+      <w:hyperlink r:id="rId77">
         <w:r>
           <w:rPr>
             <w:rStyle w:val="Hyperlink"/>
@@ -6172,92 +6162,92 @@
         </w:r>
       </w:hyperlink>
     </w:p>
+    <w:bookmarkEnd w:id="78"/>
+    <w:bookmarkStart w:id="79" w:name="X5df69cab398edda98b0028d1d2ef3313da2d6d1"/>
+    <w:p>
+      <w:pPr>
+        <w:pStyle w:val="Bibliography"/>
+      </w:pPr>
+      <w:r>
+        <w:t xml:space="preserve">Economic Research Service US Department of Agriculture. (n.d.).</w:t>
+      </w:r>
+      <w:r>
+        <w:t xml:space="preserve"> </w:t>
+      </w:r>
+      <w:r>
+        <w:rPr>
+          <w:i/>
+          <w:iCs/>
+        </w:rPr>
+        <w:t xml:space="preserve">Rural-</w:t>
+      </w:r>
+      <w:r>
+        <w:rPr>
+          <w:i/>
+          <w:iCs/>
+        </w:rPr>
+        <w:t xml:space="preserve">Urban Commuting Area Codes</w:t>
+      </w:r>
+      <w:r>
+        <w:rPr>
+          <w:i/>
+          <w:iCs/>
+        </w:rPr>
+        <w:t xml:space="preserve"> </w:t>
+      </w:r>
+      <w:r>
+        <w:rPr>
+          <w:i/>
+          <w:iCs/>
+        </w:rPr>
+        <w:t xml:space="preserve">-</w:t>
+      </w:r>
+      <w:r>
+        <w:rPr>
+          <w:i/>
+          <w:iCs/>
+        </w:rPr>
+        <w:t xml:space="preserve"> </w:t>
+      </w:r>
+      <w:r>
+        <w:rPr>
+          <w:i/>
+          <w:iCs/>
+        </w:rPr>
+        <w:t xml:space="preserve">Users</w:t>
+      </w:r>
+      <w:r>
+        <w:rPr>
+          <w:i/>
+          <w:iCs/>
+        </w:rPr>
+        <w:t xml:space="preserve">’</w:t>
+      </w:r>
+      <w:r>
+        <w:rPr>
+          <w:i/>
+          <w:iCs/>
+        </w:rPr>
+        <w:t xml:space="preserve"> </w:t>
+      </w:r>
+      <w:r>
+        <w:rPr>
+          <w:i/>
+          <w:iCs/>
+        </w:rPr>
+        <w:t xml:space="preserve">Guide</w:t>
+      </w:r>
+      <w:r>
+        <w:t xml:space="preserve">. https://www.ers.usda.gov/data-products/rural-urban-commuting-area-codes/users-guide.</w:t>
+      </w:r>
+    </w:p>
     <w:bookmarkEnd w:id="79"/>
-    <w:bookmarkStart w:id="80" w:name="X5df69cab398edda98b0028d1d2ef3313da2d6d1"/>
+    <w:bookmarkStart w:id="81" w:name="ref-epsteinPredictionStressDrug2020"/>
     <w:p>
       <w:pPr>
         <w:pStyle w:val="Bibliography"/>
       </w:pPr>
       <w:r>
-        <w:t xml:space="preserve">Economic Research Service US Department of Agriculture. (n.d.).</w:t>
-      </w:r>
-      <w:r>
-        <w:t xml:space="preserve"> </w:t>
-      </w:r>
-      <w:r>
-        <w:rPr>
-          <w:i/>
-          <w:iCs/>
-        </w:rPr>
-        <w:t xml:space="preserve">Rural-</w:t>
-      </w:r>
-      <w:r>
-        <w:rPr>
-          <w:i/>
-          <w:iCs/>
-        </w:rPr>
-        <w:t xml:space="preserve">Urban Commuting Area Codes</w:t>
-      </w:r>
-      <w:r>
-        <w:rPr>
-          <w:i/>
-          <w:iCs/>
-        </w:rPr>
-        <w:t xml:space="preserve"> </w:t>
-      </w:r>
-      <w:r>
-        <w:rPr>
-          <w:i/>
-          <w:iCs/>
-        </w:rPr>
-        <w:t xml:space="preserve">-</w:t>
-      </w:r>
-      <w:r>
-        <w:rPr>
-          <w:i/>
-          <w:iCs/>
-        </w:rPr>
-        <w:t xml:space="preserve"> </w:t>
-      </w:r>
-      <w:r>
-        <w:rPr>
-          <w:i/>
-          <w:iCs/>
-        </w:rPr>
-        <w:t xml:space="preserve">Users</w:t>
-      </w:r>
-      <w:r>
-        <w:rPr>
-          <w:i/>
-          <w:iCs/>
-        </w:rPr>
-        <w:t xml:space="preserve">’</w:t>
-      </w:r>
-      <w:r>
-        <w:rPr>
-          <w:i/>
-          <w:iCs/>
-        </w:rPr>
-        <w:t xml:space="preserve"> </w:t>
-      </w:r>
-      <w:r>
-        <w:rPr>
-          <w:i/>
-          <w:iCs/>
-        </w:rPr>
-        <w:t xml:space="preserve">Guide</w:t>
-      </w:r>
-      <w:r>
-        <w:t xml:space="preserve">. https://www.ers.usda.gov/data-products/rural-urban-commuting-area-codes/users-guide.</w:t>
-      </w:r>
-    </w:p>
-    <w:bookmarkEnd w:id="80"/>
-    <w:bookmarkStart w:id="82" w:name="ref-epsteinPredictionStressDrug2020"/>
-    <w:p>
-      <w:pPr>
-        <w:pStyle w:val="Bibliography"/>
-      </w:pPr>
-      <w:r>
         <w:t xml:space="preserve">Epstein, D. H., Tyburski, M., Kowalczyk, W. J., Burgess-Hull, A. J., Phillips, K. A., Curtis, B. L., &amp; Preston, K. L. (2020). Prediction of stress and drug craving ninety minutes in the future with passively collected</w:t>
       </w:r>
       <w:r>
@@ -6301,7 +6291,7 @@
       <w:r>
         <w:t xml:space="preserve"> </w:t>
       </w:r>
-      <w:hyperlink r:id="rId81">
+      <w:hyperlink r:id="rId80">
         <w:r>
           <w:rPr>
             <w:rStyle w:val="Hyperlink"/>
@@ -6310,8 +6300,8 @@
         </w:r>
       </w:hyperlink>
     </w:p>
-    <w:bookmarkEnd w:id="82"/>
-    <w:bookmarkStart w:id="84" w:name="ref-florenceEconomicBurdenOpioid2021"/>
+    <w:bookmarkEnd w:id="81"/>
+    <w:bookmarkStart w:id="83" w:name="ref-florenceEconomicBurdenOpioid2021"/>
     <w:p>
       <w:pPr>
         <w:pStyle w:val="Bibliography"/>
@@ -6357,7 +6347,7 @@
       <w:r>
         <w:t xml:space="preserve"> </w:t>
       </w:r>
-      <w:hyperlink r:id="rId83">
+      <w:hyperlink r:id="rId82">
         <w:r>
           <w:rPr>
             <w:rStyle w:val="Hyperlink"/>
@@ -6366,8 +6356,8 @@
         </w:r>
       </w:hyperlink>
     </w:p>
-    <w:bookmarkEnd w:id="84"/>
-    <w:bookmarkStart w:id="86" w:name="ref-freitagVariationsSubstanceUse2021"/>
+    <w:bookmarkEnd w:id="83"/>
+    <w:bookmarkStart w:id="85" w:name="ref-freitagVariationsSubstanceUse2021"/>
     <w:p>
       <w:pPr>
         <w:pStyle w:val="Bibliography"/>
@@ -6443,7 +6433,7 @@
       <w:r>
         <w:t xml:space="preserve"> </w:t>
       </w:r>
-      <w:hyperlink r:id="rId85">
+      <w:hyperlink r:id="rId84">
         <w:r>
           <w:rPr>
             <w:rStyle w:val="Hyperlink"/>
@@ -6452,78 +6442,78 @@
         </w:r>
       </w:hyperlink>
     </w:p>
+    <w:bookmarkEnd w:id="85"/>
+    <w:bookmarkStart w:id="86" w:name="ref-goodrichRstanarmBayesianApplied2023"/>
+    <w:p>
+      <w:pPr>
+        <w:pStyle w:val="Bibliography"/>
+      </w:pPr>
+      <w:r>
+        <w:t xml:space="preserve">Goodrich, B., Gabry, J., Ali, I., &amp; Brilleman, S. (2023).</w:t>
+      </w:r>
+      <w:r>
+        <w:t xml:space="preserve"> </w:t>
+      </w:r>
+      <w:r>
+        <w:rPr>
+          <w:i/>
+          <w:iCs/>
+        </w:rPr>
+        <w:t xml:space="preserve">Rstanarm:</w:t>
+      </w:r>
+      <w:r>
+        <w:rPr>
+          <w:i/>
+          <w:iCs/>
+        </w:rPr>
+        <w:t xml:space="preserve"> </w:t>
+      </w:r>
+      <w:r>
+        <w:rPr>
+          <w:i/>
+          <w:iCs/>
+        </w:rPr>
+        <w:t xml:space="preserve">Bayesian Applied Regression Modeling</w:t>
+      </w:r>
+      <w:r>
+        <w:rPr>
+          <w:i/>
+          <w:iCs/>
+        </w:rPr>
+        <w:t xml:space="preserve"> </w:t>
+      </w:r>
+      <w:r>
+        <w:rPr>
+          <w:i/>
+          <w:iCs/>
+        </w:rPr>
+        <w:t xml:space="preserve">via</w:t>
+      </w:r>
+      <w:r>
+        <w:rPr>
+          <w:i/>
+          <w:iCs/>
+        </w:rPr>
+        <w:t xml:space="preserve"> </w:t>
+      </w:r>
+      <w:r>
+        <w:rPr>
+          <w:i/>
+          <w:iCs/>
+        </w:rPr>
+        <w:t xml:space="preserve">Stan</w:t>
+      </w:r>
+      <w:r>
+        <w:t xml:space="preserve">.</w:t>
+      </w:r>
+    </w:p>
     <w:bookmarkEnd w:id="86"/>
-    <w:bookmarkStart w:id="87" w:name="ref-goodrichRstanarmBayesianApplied2023"/>
+    <w:bookmarkStart w:id="88" w:name="Xa203ab3abd150ead1a7854a9fa5726c8a273f52"/>
     <w:p>
       <w:pPr>
         <w:pStyle w:val="Bibliography"/>
       </w:pPr>
       <w:r>
-        <w:t xml:space="preserve">Goodrich, B., Gabry, J., Ali, I., &amp; Brilleman, S. (2023).</w:t>
-      </w:r>
-      <w:r>
-        <w:t xml:space="preserve"> </w:t>
-      </w:r>
-      <w:r>
-        <w:rPr>
-          <w:i/>
-          <w:iCs/>
-        </w:rPr>
-        <w:t xml:space="preserve">Rstanarm:</w:t>
-      </w:r>
-      <w:r>
-        <w:rPr>
-          <w:i/>
-          <w:iCs/>
-        </w:rPr>
-        <w:t xml:space="preserve"> </w:t>
-      </w:r>
-      <w:r>
-        <w:rPr>
-          <w:i/>
-          <w:iCs/>
-        </w:rPr>
-        <w:t xml:space="preserve">Bayesian Applied Regression Modeling</w:t>
-      </w:r>
-      <w:r>
-        <w:rPr>
-          <w:i/>
-          <w:iCs/>
-        </w:rPr>
-        <w:t xml:space="preserve"> </w:t>
-      </w:r>
-      <w:r>
-        <w:rPr>
-          <w:i/>
-          <w:iCs/>
-        </w:rPr>
-        <w:t xml:space="preserve">via</w:t>
-      </w:r>
-      <w:r>
-        <w:rPr>
-          <w:i/>
-          <w:iCs/>
-        </w:rPr>
-        <w:t xml:space="preserve"> </w:t>
-      </w:r>
-      <w:r>
-        <w:rPr>
-          <w:i/>
-          <w:iCs/>
-        </w:rPr>
-        <w:t xml:space="preserve">Stan</w:t>
-      </w:r>
-      <w:r>
-        <w:t xml:space="preserve">.</w:t>
-      </w:r>
-    </w:p>
-    <w:bookmarkEnd w:id="87"/>
-    <w:bookmarkStart w:id="89" w:name="Xa203ab3abd150ead1a7854a9fa5726c8a273f52"/>
-    <w:p>
-      <w:pPr>
-        <w:pStyle w:val="Bibliography"/>
-      </w:pPr>
-      <w:r>
         <w:t xml:space="preserve">Greenfield, S. F., Brooks, A. J., Gordon, S. M., Green, C. A., Kropp, F., McHugh, R. K., Lincoln, M., Hien, D., &amp; Miele, G. M. (2007). Substance abuse treatment entry, retention, and outcome in women:</w:t>
       </w:r>
       <w:r>
@@ -6567,7 +6557,7 @@
       <w:r>
         <w:t xml:space="preserve"> </w:t>
       </w:r>
-      <w:hyperlink r:id="rId88">
+      <w:hyperlink r:id="rId87">
         <w:r>
           <w:rPr>
             <w:rStyle w:val="Hyperlink"/>
@@ -6576,153 +6566,153 @@
         </w:r>
       </w:hyperlink>
     </w:p>
+    <w:bookmarkEnd w:id="88"/>
+    <w:bookmarkStart w:id="89" w:name="ref-grovesPrinciplesGNSSInertial2013"/>
+    <w:p>
+      <w:pPr>
+        <w:pStyle w:val="Bibliography"/>
+      </w:pPr>
+      <w:r>
+        <w:t xml:space="preserve">Groves, P. (2013).</w:t>
+      </w:r>
+      <w:r>
+        <w:t xml:space="preserve"> </w:t>
+      </w:r>
+      <w:r>
+        <w:rPr>
+          <w:i/>
+          <w:iCs/>
+        </w:rPr>
+        <w:t xml:space="preserve">Principles of</w:t>
+      </w:r>
+      <w:r>
+        <w:rPr>
+          <w:i/>
+          <w:iCs/>
+        </w:rPr>
+        <w:t xml:space="preserve"> </w:t>
+      </w:r>
+      <w:r>
+        <w:rPr>
+          <w:i/>
+          <w:iCs/>
+        </w:rPr>
+        <w:t xml:space="preserve">GNSS</w:t>
+      </w:r>
+      <w:r>
+        <w:rPr>
+          <w:i/>
+          <w:iCs/>
+        </w:rPr>
+        <w:t xml:space="preserve">,</w:t>
+      </w:r>
+      <w:r>
+        <w:rPr>
+          <w:i/>
+          <w:iCs/>
+        </w:rPr>
+        <w:t xml:space="preserve"> </w:t>
+      </w:r>
+      <w:r>
+        <w:rPr>
+          <w:i/>
+          <w:iCs/>
+        </w:rPr>
+        <w:t xml:space="preserve">Inertial</w:t>
+      </w:r>
+      <w:r>
+        <w:rPr>
+          <w:i/>
+          <w:iCs/>
+        </w:rPr>
+        <w:t xml:space="preserve">, and</w:t>
+      </w:r>
+      <w:r>
+        <w:rPr>
+          <w:i/>
+          <w:iCs/>
+        </w:rPr>
+        <w:t xml:space="preserve"> </w:t>
+      </w:r>
+      <w:r>
+        <w:rPr>
+          <w:i/>
+          <w:iCs/>
+        </w:rPr>
+        <w:t xml:space="preserve">Multisensor Integrated Navigation Systems</w:t>
+      </w:r>
+      <w:r>
+        <w:rPr>
+          <w:i/>
+          <w:iCs/>
+        </w:rPr>
+        <w:t xml:space="preserve">,</w:t>
+      </w:r>
+      <w:r>
+        <w:rPr>
+          <w:i/>
+          <w:iCs/>
+        </w:rPr>
+        <w:t xml:space="preserve"> </w:t>
+      </w:r>
+      <w:r>
+        <w:rPr>
+          <w:i/>
+          <w:iCs/>
+        </w:rPr>
+        <w:t xml:space="preserve">Second Edition</w:t>
+      </w:r>
+      <w:r>
+        <w:t xml:space="preserve">.</w:t>
+      </w:r>
+    </w:p>
     <w:bookmarkEnd w:id="89"/>
-    <w:bookmarkStart w:id="90" w:name="ref-grovesPrinciplesGNSSInertial2013"/>
+    <w:bookmarkStart w:id="91" w:name="X6b4ed3beef40dcba9764db2c38b474dc4669eb8"/>
     <w:p>
       <w:pPr>
         <w:pStyle w:val="Bibliography"/>
       </w:pPr>
       <w:r>
-        <w:t xml:space="preserve">Groves, P. (2013).</w:t>
-      </w:r>
-      <w:r>
-        <w:t xml:space="preserve"> </w:t>
-      </w:r>
-      <w:r>
-        <w:rPr>
-          <w:i/>
-          <w:iCs/>
-        </w:rPr>
-        <w:t xml:space="preserve">Principles of</w:t>
-      </w:r>
-      <w:r>
-        <w:rPr>
-          <w:i/>
-          <w:iCs/>
-        </w:rPr>
-        <w:t xml:space="preserve"> </w:t>
-      </w:r>
-      <w:r>
-        <w:rPr>
-          <w:i/>
-          <w:iCs/>
-        </w:rPr>
-        <w:t xml:space="preserve">GNSS</w:t>
-      </w:r>
-      <w:r>
-        <w:rPr>
-          <w:i/>
-          <w:iCs/>
-        </w:rPr>
+        <w:t xml:space="preserve">Guerrero, E. G., Marsh, J. C., Khachikian, T., Amaro, H., &amp; Vega, W. A. (2013). Disparities in</w:t>
+      </w:r>
+      <w:r>
+        <w:t xml:space="preserve"> </w:t>
+      </w:r>
+      <w:r>
+        <w:t xml:space="preserve">Latino</w:t>
+      </w:r>
+      <w:r>
+        <w:t xml:space="preserve"> </w:t>
+      </w:r>
+      <w:r>
+        <w:t xml:space="preserve">substance use, service use, and treatment:</w:t>
+      </w:r>
+      <w:r>
+        <w:t xml:space="preserve"> </w:t>
+      </w:r>
+      <w:r>
+        <w:t xml:space="preserve">Implications</w:t>
+      </w:r>
+      <w:r>
+        <w:t xml:space="preserve"> </w:t>
+      </w:r>
+      <w:r>
+        <w:t xml:space="preserve">for culturally and evidence-based interventions under health care reform.</w:t>
+      </w:r>
+      <w:r>
+        <w:t xml:space="preserve"> </w:t>
+      </w:r>
+      <w:r>
+        <w:rPr>
+          <w:i/>
+          <w:iCs/>
+        </w:rPr>
+        <w:t xml:space="preserve">Drug and Alcohol Dependence</w:t>
+      </w:r>
+      <w:r>
         <w:t xml:space="preserve">,</w:t>
       </w:r>
       <w:r>
-        <w:rPr>
-          <w:i/>
-          <w:iCs/>
-        </w:rPr>
-        <w:t xml:space="preserve"> </w:t>
-      </w:r>
-      <w:r>
-        <w:rPr>
-          <w:i/>
-          <w:iCs/>
-        </w:rPr>
-        <w:t xml:space="preserve">Inertial</w:t>
-      </w:r>
-      <w:r>
-        <w:rPr>
-          <w:i/>
-          <w:iCs/>
-        </w:rPr>
-        <w:t xml:space="preserve">, and</w:t>
-      </w:r>
-      <w:r>
-        <w:rPr>
-          <w:i/>
-          <w:iCs/>
-        </w:rPr>
-        <w:t xml:space="preserve"> </w:t>
-      </w:r>
-      <w:r>
-        <w:rPr>
-          <w:i/>
-          <w:iCs/>
-        </w:rPr>
-        <w:t xml:space="preserve">Multisensor Integrated Navigation Systems</w:t>
-      </w:r>
-      <w:r>
-        <w:rPr>
-          <w:i/>
-          <w:iCs/>
-        </w:rPr>
-        <w:t xml:space="preserve">,</w:t>
-      </w:r>
-      <w:r>
-        <w:rPr>
-          <w:i/>
-          <w:iCs/>
-        </w:rPr>
-        <w:t xml:space="preserve"> </w:t>
-      </w:r>
-      <w:r>
-        <w:rPr>
-          <w:i/>
-          <w:iCs/>
-        </w:rPr>
-        <w:t xml:space="preserve">Second Edition</w:t>
-      </w:r>
-      <w:r>
-        <w:t xml:space="preserve">.</w:t>
-      </w:r>
-    </w:p>
-    <w:bookmarkEnd w:id="90"/>
-    <w:bookmarkStart w:id="92" w:name="X6b4ed3beef40dcba9764db2c38b474dc4669eb8"/>
-    <w:p>
-      <w:pPr>
-        <w:pStyle w:val="Bibliography"/>
-      </w:pPr>
-      <w:r>
-        <w:t xml:space="preserve">Guerrero, E. G., Marsh, J. C., Khachikian, T., Amaro, H., &amp; Vega, W. A. (2013). Disparities in</w:t>
-      </w:r>
-      <w:r>
-        <w:t xml:space="preserve"> </w:t>
-      </w:r>
-      <w:r>
-        <w:t xml:space="preserve">Latino</w:t>
-      </w:r>
-      <w:r>
-        <w:t xml:space="preserve"> </w:t>
-      </w:r>
-      <w:r>
-        <w:t xml:space="preserve">substance use, service use, and treatment:</w:t>
-      </w:r>
-      <w:r>
-        <w:t xml:space="preserve"> </w:t>
-      </w:r>
-      <w:r>
-        <w:t xml:space="preserve">Implications</w:t>
-      </w:r>
-      <w:r>
-        <w:t xml:space="preserve"> </w:t>
-      </w:r>
-      <w:r>
-        <w:t xml:space="preserve">for culturally and evidence-based interventions under health care reform.</w:t>
-      </w:r>
-      <w:r>
-        <w:t xml:space="preserve"> </w:t>
-      </w:r>
-      <w:r>
-        <w:rPr>
-          <w:i/>
-          <w:iCs/>
-        </w:rPr>
-        <w:t xml:space="preserve">Drug and Alcohol Dependence</w:t>
-      </w:r>
-      <w:r>
-        <w:t xml:space="preserve">,</w:t>
-      </w:r>
-      <w:r>
         <w:t xml:space="preserve"> </w:t>
       </w:r>
       <w:r>
@@ -6738,7 +6728,7 @@
       <w:r>
         <w:t xml:space="preserve"> </w:t>
       </w:r>
-      <w:hyperlink r:id="rId91">
+      <w:hyperlink r:id="rId90">
         <w:r>
           <w:rPr>
             <w:rStyle w:val="Hyperlink"/>
@@ -6747,8 +6737,8 @@
         </w:r>
       </w:hyperlink>
     </w:p>
-    <w:bookmarkEnd w:id="92"/>
-    <w:bookmarkStart w:id="94" w:name="X805b64c6cb0e2e29672f0738918e5324c4e18a1"/>
+    <w:bookmarkEnd w:id="91"/>
+    <w:bookmarkStart w:id="93" w:name="X805b64c6cb0e2e29672f0738918e5324c4e18a1"/>
     <w:p>
       <w:pPr>
         <w:pStyle w:val="Bibliography"/>
@@ -6785,7 +6775,7 @@
       <w:r>
         <w:t xml:space="preserve"> </w:t>
       </w:r>
-      <w:hyperlink r:id="rId93">
+      <w:hyperlink r:id="rId92">
         <w:r>
           <w:rPr>
             <w:rStyle w:val="Hyperlink"/>
@@ -6794,50 +6784,50 @@
         </w:r>
       </w:hyperlink>
     </w:p>
+    <w:bookmarkEnd w:id="93"/>
+    <w:bookmarkStart w:id="94" w:name="X8b12ef138ca23b48f269e0b446537ae876fd725"/>
+    <w:p>
+      <w:pPr>
+        <w:pStyle w:val="Bibliography"/>
+      </w:pPr>
+      <w:r>
+        <w:t xml:space="preserve">Health Resources and Services Administration. (n.d.).</w:t>
+      </w:r>
+      <w:r>
+        <w:t xml:space="preserve"> </w:t>
+      </w:r>
+      <w:r>
+        <w:rPr>
+          <w:i/>
+          <w:iCs/>
+        </w:rPr>
+        <w:t xml:space="preserve">How</w:t>
+      </w:r>
+      <w:r>
+        <w:rPr>
+          <w:i/>
+          <w:iCs/>
+        </w:rPr>
+        <w:t xml:space="preserve"> </w:t>
+      </w:r>
+      <w:r>
+        <w:rPr>
+          <w:i/>
+          <w:iCs/>
+        </w:rPr>
+        <w:t xml:space="preserve">We Define Rural</w:t>
+      </w:r>
+      <w:r>
+        <w:t xml:space="preserve">. https://www.hrsa.gov/rural-health/about-us/what-is-rural.</w:t>
+      </w:r>
+    </w:p>
     <w:bookmarkEnd w:id="94"/>
-    <w:bookmarkStart w:id="95" w:name="X8b12ef138ca23b48f269e0b446537ae876fd725"/>
+    <w:bookmarkStart w:id="96" w:name="X124ba946b4d19c4d3454f7989a2955eb824b98a"/>
     <w:p>
       <w:pPr>
         <w:pStyle w:val="Bibliography"/>
       </w:pPr>
       <w:r>
-        <w:t xml:space="preserve">Health Resources and Services Administration. (n.d.).</w:t>
-      </w:r>
-      <w:r>
-        <w:t xml:space="preserve"> </w:t>
-      </w:r>
-      <w:r>
-        <w:rPr>
-          <w:i/>
-          <w:iCs/>
-        </w:rPr>
-        <w:t xml:space="preserve">How</w:t>
-      </w:r>
-      <w:r>
-        <w:rPr>
-          <w:i/>
-          <w:iCs/>
-        </w:rPr>
-        <w:t xml:space="preserve"> </w:t>
-      </w:r>
-      <w:r>
-        <w:rPr>
-          <w:i/>
-          <w:iCs/>
-        </w:rPr>
-        <w:t xml:space="preserve">We Define Rural</w:t>
-      </w:r>
-      <w:r>
-        <w:t xml:space="preserve">. https://www.hrsa.gov/rural-health/about-us/what-is-rural.</w:t>
-      </w:r>
-    </w:p>
-    <w:bookmarkEnd w:id="95"/>
-    <w:bookmarkStart w:id="97" w:name="X124ba946b4d19c4d3454f7989a2955eb824b98a"/>
-    <w:p>
-      <w:pPr>
-        <w:pStyle w:val="Bibliography"/>
-      </w:pPr>
-      <w:r>
         <w:t xml:space="preserve">Heinz, M. V., Price, G. D., Singh, A., Bhattacharya, S., Chen, C.-H., Asyyed, A., Does, M. B., Hassanpour, S., Hichborn, E., Kotz, D., Lambert-Harris, C. A., Li, Z., McLeman, B., Mishra, V., Stanger, C., Subramaniam, G., Wu, W., Campbell, C. I., Marsch, L. A., &amp; Jacobson, N. C. (2025). A longitudinal observational study with ecological momentary assessment and deep learning to predict non-prescribed opioid use, treatment retention, and medication nonadherence among persons receiving medication treatment for opioid use disorder.</w:t>
       </w:r>
       <w:r>
@@ -6869,7 +6859,7 @@
       <w:r>
         <w:t xml:space="preserve"> </w:t>
       </w:r>
-      <w:hyperlink r:id="rId96">
+      <w:hyperlink r:id="rId95">
         <w:r>
           <w:rPr>
             <w:rStyle w:val="Hyperlink"/>
@@ -6878,8 +6868,8 @@
         </w:r>
       </w:hyperlink>
     </w:p>
-    <w:bookmarkEnd w:id="97"/>
-    <w:bookmarkStart w:id="99" w:name="ref-hserHighMortalityPatients2017"/>
+    <w:bookmarkEnd w:id="96"/>
+    <w:bookmarkStart w:id="98" w:name="ref-hserHighMortalityPatients2017"/>
     <w:p>
       <w:pPr>
         <w:pStyle w:val="Bibliography"/>
@@ -6937,7 +6927,7 @@
       <w:r>
         <w:t xml:space="preserve"> </w:t>
       </w:r>
-      <w:hyperlink r:id="rId98">
+      <w:hyperlink r:id="rId97">
         <w:r>
           <w:rPr>
             <w:rStyle w:val="Hyperlink"/>
@@ -6946,8 +6936,8 @@
         </w:r>
       </w:hyperlink>
     </w:p>
-    <w:bookmarkEnd w:id="99"/>
-    <w:bookmarkStart w:id="101" w:name="X9dfa929848d202736296032659cec14e42606bb"/>
+    <w:bookmarkEnd w:id="98"/>
+    <w:bookmarkStart w:id="100" w:name="X9dfa929848d202736296032659cec14e42606bb"/>
     <w:p>
       <w:pPr>
         <w:pStyle w:val="Bibliography"/>
@@ -6984,7 +6974,7 @@
       <w:r>
         <w:t xml:space="preserve"> </w:t>
       </w:r>
-      <w:hyperlink r:id="rId100">
+      <w:hyperlink r:id="rId99">
         <w:r>
           <w:rPr>
             <w:rStyle w:val="Hyperlink"/>
@@ -6993,8 +6983,8 @@
         </w:r>
       </w:hyperlink>
     </w:p>
-    <w:bookmarkEnd w:id="101"/>
-    <w:bookmarkStart w:id="103" w:name="ref-kilaruIncidenceTreatmentOpioid2020"/>
+    <w:bookmarkEnd w:id="100"/>
+    <w:bookmarkStart w:id="102" w:name="ref-kilaruIncidenceTreatmentOpioid2020"/>
     <w:p>
       <w:pPr>
         <w:pStyle w:val="Bibliography"/>
@@ -7064,7 +7054,7 @@
       <w:r>
         <w:t xml:space="preserve"> </w:t>
       </w:r>
-      <w:hyperlink r:id="rId102">
+      <w:hyperlink r:id="rId101">
         <w:r>
           <w:rPr>
             <w:rStyle w:val="Hyperlink"/>
@@ -7073,129 +7063,129 @@
         </w:r>
       </w:hyperlink>
     </w:p>
+    <w:bookmarkEnd w:id="102"/>
+    <w:bookmarkStart w:id="103" w:name="Xa93a98d1ce255982a5ea923c39451c32053b2a2"/>
+    <w:p>
+      <w:pPr>
+        <w:pStyle w:val="Bibliography"/>
+      </w:pPr>
+      <w:r>
+        <w:t xml:space="preserve">Kuhn, M. (2022).</w:t>
+      </w:r>
+      <w:r>
+        <w:t xml:space="preserve"> </w:t>
+      </w:r>
+      <w:r>
+        <w:rPr>
+          <w:i/>
+          <w:iCs/>
+        </w:rPr>
+        <w:t xml:space="preserve">Tidyposterior:</w:t>
+      </w:r>
+      <w:r>
+        <w:rPr>
+          <w:i/>
+          <w:iCs/>
+        </w:rPr>
+        <w:t xml:space="preserve"> </w:t>
+      </w:r>
+      <w:r>
+        <w:rPr>
+          <w:i/>
+          <w:iCs/>
+        </w:rPr>
+        <w:t xml:space="preserve">Bayesian Analysis</w:t>
+      </w:r>
+      <w:r>
+        <w:rPr>
+          <w:i/>
+          <w:iCs/>
+        </w:rPr>
+        <w:t xml:space="preserve"> </w:t>
+      </w:r>
+      <w:r>
+        <w:rPr>
+          <w:i/>
+          <w:iCs/>
+        </w:rPr>
+        <w:t xml:space="preserve">to</w:t>
+      </w:r>
+      <w:r>
+        <w:rPr>
+          <w:i/>
+          <w:iCs/>
+        </w:rPr>
+        <w:t xml:space="preserve"> </w:t>
+      </w:r>
+      <w:r>
+        <w:rPr>
+          <w:i/>
+          <w:iCs/>
+        </w:rPr>
+        <w:t xml:space="preserve">Compare Models</w:t>
+      </w:r>
+      <w:r>
+        <w:rPr>
+          <w:i/>
+          <w:iCs/>
+        </w:rPr>
+        <w:t xml:space="preserve"> </w:t>
+      </w:r>
+      <w:r>
+        <w:rPr>
+          <w:i/>
+          <w:iCs/>
+        </w:rPr>
+        <w:t xml:space="preserve">using</w:t>
+      </w:r>
+      <w:r>
+        <w:rPr>
+          <w:i/>
+          <w:iCs/>
+        </w:rPr>
+        <w:t xml:space="preserve"> </w:t>
+      </w:r>
+      <w:r>
+        <w:rPr>
+          <w:i/>
+          <w:iCs/>
+        </w:rPr>
+        <w:t xml:space="preserve">Resampling Statistics</w:t>
+      </w:r>
+      <w:r>
+        <w:t xml:space="preserve">.</w:t>
+      </w:r>
+    </w:p>
     <w:bookmarkEnd w:id="103"/>
-    <w:bookmarkStart w:id="104" w:name="Xa93a98d1ce255982a5ea923c39451c32053b2a2"/>
+    <w:bookmarkStart w:id="104" w:name="ref-kuhnTidymodelsCollectionPackages2020"/>
     <w:p>
       <w:pPr>
         <w:pStyle w:val="Bibliography"/>
       </w:pPr>
       <w:r>
-        <w:t xml:space="preserve">Kuhn, M. (2022).</w:t>
-      </w:r>
-      <w:r>
-        <w:t xml:space="preserve"> </w:t>
-      </w:r>
-      <w:r>
-        <w:rPr>
-          <w:i/>
-          <w:iCs/>
-        </w:rPr>
-        <w:t xml:space="preserve">Tidyposterior:</w:t>
-      </w:r>
-      <w:r>
-        <w:rPr>
-          <w:i/>
-          <w:iCs/>
-        </w:rPr>
-        <w:t xml:space="preserve"> </w:t>
-      </w:r>
-      <w:r>
-        <w:rPr>
-          <w:i/>
-          <w:iCs/>
-        </w:rPr>
-        <w:t xml:space="preserve">Bayesian Analysis</w:t>
-      </w:r>
-      <w:r>
-        <w:rPr>
-          <w:i/>
-          <w:iCs/>
-        </w:rPr>
-        <w:t xml:space="preserve"> </w:t>
-      </w:r>
-      <w:r>
-        <w:rPr>
-          <w:i/>
-          <w:iCs/>
-        </w:rPr>
-        <w:t xml:space="preserve">to</w:t>
-      </w:r>
-      <w:r>
-        <w:rPr>
-          <w:i/>
-          <w:iCs/>
-        </w:rPr>
-        <w:t xml:space="preserve"> </w:t>
-      </w:r>
-      <w:r>
-        <w:rPr>
-          <w:i/>
-          <w:iCs/>
-        </w:rPr>
-        <w:t xml:space="preserve">Compare Models</w:t>
-      </w:r>
-      <w:r>
-        <w:rPr>
-          <w:i/>
-          <w:iCs/>
-        </w:rPr>
-        <w:t xml:space="preserve"> </w:t>
-      </w:r>
-      <w:r>
-        <w:rPr>
-          <w:i/>
-          <w:iCs/>
-        </w:rPr>
-        <w:t xml:space="preserve">using</w:t>
-      </w:r>
-      <w:r>
-        <w:rPr>
-          <w:i/>
-          <w:iCs/>
-        </w:rPr>
-        <w:t xml:space="preserve"> </w:t>
-      </w:r>
-      <w:r>
-        <w:rPr>
-          <w:i/>
-          <w:iCs/>
-        </w:rPr>
-        <w:t xml:space="preserve">Resampling Statistics</w:t>
+        <w:t xml:space="preserve">Kuhn, M., &amp; Wickham, H. (2020).</w:t>
+      </w:r>
+      <w:r>
+        <w:t xml:space="preserve"> </w:t>
+      </w:r>
+      <w:r>
+        <w:rPr>
+          <w:i/>
+          <w:iCs/>
+        </w:rPr>
+        <w:t xml:space="preserve">Tidymodels: A collection of packages for modeling and machine learning using tidyverse principles</w:t>
       </w:r>
       <w:r>
         <w:t xml:space="preserve">.</w:t>
       </w:r>
     </w:p>
     <w:bookmarkEnd w:id="104"/>
-    <w:bookmarkStart w:id="105" w:name="ref-kuhnTidymodelsCollectionPackages2020"/>
+    <w:bookmarkStart w:id="106" w:name="X3767008d16a8293168c856ccfc7bd4044275213"/>
     <w:p>
       <w:pPr>
         <w:pStyle w:val="Bibliography"/>
       </w:pPr>
       <w:r>
-        <w:t xml:space="preserve">Kuhn, M., &amp; Wickham, H. (2020).</w:t>
-      </w:r>
-      <w:r>
-        <w:t xml:space="preserve"> </w:t>
-      </w:r>
-      <w:r>
-        <w:rPr>
-          <w:i/>
-          <w:iCs/>
-        </w:rPr>
-        <w:t xml:space="preserve">Tidymodels: A collection of packages for modeling and machine learning using tidyverse principles</w:t>
-      </w:r>
-      <w:r>
-        <w:t xml:space="preserve">.</w:t>
-      </w:r>
-    </w:p>
-    <w:bookmarkEnd w:id="105"/>
-    <w:bookmarkStart w:id="107" w:name="X3767008d16a8293168c856ccfc7bd4044275213"/>
-    <w:p>
-      <w:pPr>
-        <w:pStyle w:val="Bibliography"/>
-      </w:pPr>
-      <w:r>
         <w:t xml:space="preserve">Leenaerts, N., Soyster, P., Ceccarini, J., Sunaert, S., Fisher, A., &amp; Vrieze, E. (2024). Person-specific and pooled prediction models for binge eating, alcohol use and binge drinking in bulimia nervosa and alcohol use disorder.</w:t>
       </w:r>
       <w:r>
@@ -7227,7 +7217,7 @@
       <w:r>
         <w:t xml:space="preserve"> </w:t>
       </w:r>
-      <w:hyperlink r:id="rId106">
+      <w:hyperlink r:id="rId105">
         <w:r>
           <w:rPr>
             <w:rStyle w:val="Hyperlink"/>
@@ -7236,8 +7226,8 @@
         </w:r>
       </w:hyperlink>
     </w:p>
-    <w:bookmarkEnd w:id="107"/>
-    <w:bookmarkStart w:id="109" w:name="Xaa720cc9c8d959b428cd2035783815a9cba15e0"/>
+    <w:bookmarkEnd w:id="106"/>
+    <w:bookmarkStart w:id="108" w:name="Xaa720cc9c8d959b428cd2035783815a9cba15e0"/>
     <w:p>
       <w:pPr>
         <w:pStyle w:val="Bibliography"/>
@@ -7283,7 +7273,7 @@
       <w:r>
         <w:t xml:space="preserve"> </w:t>
       </w:r>
-      <w:hyperlink r:id="rId108">
+      <w:hyperlink r:id="rId107">
         <w:r>
           <w:rPr>
             <w:rStyle w:val="Hyperlink"/>
@@ -7292,8 +7282,8 @@
         </w:r>
       </w:hyperlink>
     </w:p>
-    <w:bookmarkEnd w:id="109"/>
-    <w:bookmarkStart w:id="111" w:name="ref-lofaroRuralUrbanDifferences2025"/>
+    <w:bookmarkEnd w:id="108"/>
+    <w:bookmarkStart w:id="110" w:name="ref-lofaroRuralUrbanDifferences2025"/>
     <w:p>
       <w:pPr>
         <w:pStyle w:val="Bibliography"/>
@@ -7330,7 +7320,7 @@
       <w:r>
         <w:t xml:space="preserve"> </w:t>
       </w:r>
-      <w:hyperlink r:id="rId110">
+      <w:hyperlink r:id="rId109">
         <w:r>
           <w:rPr>
             <w:rStyle w:val="Hyperlink"/>
@@ -7339,122 +7329,122 @@
         </w:r>
       </w:hyperlink>
     </w:p>
+    <w:bookmarkEnd w:id="110"/>
+    <w:bookmarkStart w:id="111" w:name="X34be55f2a2ff67a14e7206627bb93b426490c87"/>
+    <w:p>
+      <w:pPr>
+        <w:pStyle w:val="Bibliography"/>
+      </w:pPr>
+      <w:r>
+        <w:t xml:space="preserve">Lundberg, S. M., &amp; Lee, S.-I. (2017). A unified approach to interpreting model predictions.</w:t>
+      </w:r>
+      <w:r>
+        <w:t xml:space="preserve"> </w:t>
+      </w:r>
+      <w:r>
+        <w:rPr>
+          <w:i/>
+          <w:iCs/>
+        </w:rPr>
+        <w:t xml:space="preserve">Proceedings of the 31st</w:t>
+      </w:r>
+      <w:r>
+        <w:rPr>
+          <w:i/>
+          <w:iCs/>
+        </w:rPr>
+        <w:t xml:space="preserve"> </w:t>
+      </w:r>
+      <w:r>
+        <w:rPr>
+          <w:i/>
+          <w:iCs/>
+        </w:rPr>
+        <w:t xml:space="preserve">International Conference</w:t>
+      </w:r>
+      <w:r>
+        <w:rPr>
+          <w:i/>
+          <w:iCs/>
+        </w:rPr>
+        <w:t xml:space="preserve"> </w:t>
+      </w:r>
+      <w:r>
+        <w:rPr>
+          <w:i/>
+          <w:iCs/>
+        </w:rPr>
+        <w:t xml:space="preserve">on</w:t>
+      </w:r>
+      <w:r>
+        <w:rPr>
+          <w:i/>
+          <w:iCs/>
+        </w:rPr>
+        <w:t xml:space="preserve"> </w:t>
+      </w:r>
+      <w:r>
+        <w:rPr>
+          <w:i/>
+          <w:iCs/>
+        </w:rPr>
+        <w:t xml:space="preserve">Neural Information Processing Systems</w:t>
+      </w:r>
+      <w:r>
+        <w:rPr>
+          <w:i/>
+          <w:iCs/>
+        </w:rPr>
+        <w:t xml:space="preserve">,</w:t>
+      </w:r>
+      <w:r>
+        <w:rPr>
+          <w:i/>
+          <w:iCs/>
+        </w:rPr>
+        <w:t xml:space="preserve"> </w:t>
+      </w:r>
+      <w:r>
+        <w:rPr>
+          <w:i/>
+          <w:iCs/>
+        </w:rPr>
+        <w:t xml:space="preserve">NIPS</w:t>
+      </w:r>
+      <w:r>
+        <w:rPr>
+          <w:i/>
+          <w:iCs/>
+        </w:rPr>
+        <w:t xml:space="preserve">’17</w:t>
+      </w:r>
+      <w:r>
+        <w:t xml:space="preserve">, 4768–4777.</w:t>
+      </w:r>
+    </w:p>
     <w:bookmarkEnd w:id="111"/>
-    <w:bookmarkStart w:id="112" w:name="X34be55f2a2ff67a14e7206627bb93b426490c87"/>
+    <w:bookmarkStart w:id="113" w:name="Xcd5b1eed29ae982ceb2faccc95458d58289f03d"/>
     <w:p>
       <w:pPr>
         <w:pStyle w:val="Bibliography"/>
       </w:pPr>
       <w:r>
-        <w:t xml:space="preserve">Lundberg, S. M., &amp; Lee, S.-I. (2017). A unified approach to interpreting model predictions.</w:t>
-      </w:r>
-      <w:r>
-        <w:t xml:space="preserve"> </w:t>
-      </w:r>
-      <w:r>
-        <w:rPr>
-          <w:i/>
-          <w:iCs/>
-        </w:rPr>
-        <w:t xml:space="preserve">Proceedings of the 31st</w:t>
-      </w:r>
-      <w:r>
-        <w:rPr>
-          <w:i/>
-          <w:iCs/>
-        </w:rPr>
-        <w:t xml:space="preserve"> </w:t>
-      </w:r>
-      <w:r>
-        <w:rPr>
-          <w:i/>
-          <w:iCs/>
-        </w:rPr>
-        <w:t xml:space="preserve">International Conference</w:t>
-      </w:r>
-      <w:r>
-        <w:rPr>
-          <w:i/>
-          <w:iCs/>
-        </w:rPr>
-        <w:t xml:space="preserve"> </w:t>
-      </w:r>
-      <w:r>
-        <w:rPr>
-          <w:i/>
-          <w:iCs/>
-        </w:rPr>
-        <w:t xml:space="preserve">on</w:t>
-      </w:r>
-      <w:r>
-        <w:rPr>
-          <w:i/>
-          <w:iCs/>
-        </w:rPr>
-        <w:t xml:space="preserve"> </w:t>
-      </w:r>
-      <w:r>
-        <w:rPr>
-          <w:i/>
-          <w:iCs/>
-        </w:rPr>
-        <w:t xml:space="preserve">Neural Information Processing Systems</w:t>
-      </w:r>
-      <w:r>
-        <w:rPr>
-          <w:i/>
-          <w:iCs/>
-        </w:rPr>
+        <w:t xml:space="preserve">Ma, J., Bao, Y.-P., Wang, R.-J., Su, M.-F., Liu, M.-X., Li, J.-Q., Degenhardt, L., Farrell, M., Blow, F. C., Ilgen, M., Shi, J., &amp; Lu, L. (2019). Effects of medication-assisted treatment on mortality among opioids users: A systematic review and meta-analysis.</w:t>
+      </w:r>
+      <w:r>
+        <w:t xml:space="preserve"> </w:t>
+      </w:r>
+      <w:r>
+        <w:rPr>
+          <w:i/>
+          <w:iCs/>
+        </w:rPr>
+        <w:t xml:space="preserve">Molecular Psychiatry</w:t>
+      </w:r>
+      <w:r>
         <w:t xml:space="preserve">,</w:t>
       </w:r>
       <w:r>
-        <w:rPr>
-          <w:i/>
-          <w:iCs/>
-        </w:rPr>
-        <w:t xml:space="preserve"> </w:t>
-      </w:r>
-      <w:r>
-        <w:rPr>
-          <w:i/>
-          <w:iCs/>
-        </w:rPr>
-        <w:t xml:space="preserve">NIPS</w:t>
-      </w:r>
-      <w:r>
-        <w:rPr>
-          <w:i/>
-          <w:iCs/>
-        </w:rPr>
-        <w:t xml:space="preserve">’17</w:t>
-      </w:r>
-      <w:r>
-        <w:t xml:space="preserve">, 4768–4777.</w:t>
-      </w:r>
-    </w:p>
-    <w:bookmarkEnd w:id="112"/>
-    <w:bookmarkStart w:id="114" w:name="Xcd5b1eed29ae982ceb2faccc95458d58289f03d"/>
-    <w:p>
-      <w:pPr>
-        <w:pStyle w:val="Bibliography"/>
-      </w:pPr>
-      <w:r>
-        <w:t xml:space="preserve">Ma, J., Bao, Y.-P., Wang, R.-J., Su, M.-F., Liu, M.-X., Li, J.-Q., Degenhardt, L., Farrell, M., Blow, F. C., Ilgen, M., Shi, J., &amp; Lu, L. (2019). Effects of medication-assisted treatment on mortality among opioids users: A systematic review and meta-analysis.</w:t>
-      </w:r>
-      <w:r>
-        <w:t xml:space="preserve"> </w:t>
-      </w:r>
-      <w:r>
-        <w:rPr>
-          <w:i/>
-          <w:iCs/>
-        </w:rPr>
-        <w:t xml:space="preserve">Molecular Psychiatry</w:t>
-      </w:r>
-      <w:r>
-        <w:t xml:space="preserve">,</w:t>
-      </w:r>
-      <w:r>
         <w:t xml:space="preserve"> </w:t>
       </w:r>
       <w:r>
@@ -7470,7 +7460,7 @@
       <w:r>
         <w:t xml:space="preserve"> </w:t>
       </w:r>
-      <w:hyperlink r:id="rId113">
+      <w:hyperlink r:id="rId112">
         <w:r>
           <w:rPr>
             <w:rStyle w:val="Hyperlink"/>
@@ -7479,213 +7469,213 @@
         </w:r>
       </w:hyperlink>
     </w:p>
+    <w:bookmarkEnd w:id="113"/>
+    <w:bookmarkStart w:id="114" w:name="ref-marlattRelapsePreventionSecond2007"/>
+    <w:p>
+      <w:pPr>
+        <w:pStyle w:val="Bibliography"/>
+      </w:pPr>
+      <w:r>
+        <w:t xml:space="preserve">Marlatt, G. A., &amp; Donovan, D. M. (Eds.). (2007).</w:t>
+      </w:r>
+      <w:r>
+        <w:t xml:space="preserve"> </w:t>
+      </w:r>
+      <w:r>
+        <w:rPr>
+          <w:i/>
+          <w:iCs/>
+        </w:rPr>
+        <w:t xml:space="preserve">Relapse</w:t>
+      </w:r>
+      <w:r>
+        <w:rPr>
+          <w:i/>
+          <w:iCs/>
+        </w:rPr>
+        <w:t xml:space="preserve"> </w:t>
+      </w:r>
+      <w:r>
+        <w:rPr>
+          <w:i/>
+          <w:iCs/>
+        </w:rPr>
+        <w:t xml:space="preserve">Prevention</w:t>
+      </w:r>
+      <w:r>
+        <w:rPr>
+          <w:i/>
+          <w:iCs/>
+        </w:rPr>
+        <w:t xml:space="preserve">,</w:t>
+      </w:r>
+      <w:r>
+        <w:rPr>
+          <w:i/>
+          <w:iCs/>
+        </w:rPr>
+        <w:t xml:space="preserve"> </w:t>
+      </w:r>
+      <w:r>
+        <w:rPr>
+          <w:i/>
+          <w:iCs/>
+        </w:rPr>
+        <w:t xml:space="preserve">Second Edition</w:t>
+      </w:r>
+      <w:r>
+        <w:rPr>
+          <w:i/>
+          <w:iCs/>
+        </w:rPr>
+        <w:t xml:space="preserve">:</w:t>
+      </w:r>
+      <w:r>
+        <w:rPr>
+          <w:i/>
+          <w:iCs/>
+        </w:rPr>
+        <w:t xml:space="preserve"> </w:t>
+      </w:r>
+      <w:r>
+        <w:rPr>
+          <w:i/>
+          <w:iCs/>
+        </w:rPr>
+        <w:t xml:space="preserve">Maintenance Strategies</w:t>
+      </w:r>
+      <w:r>
+        <w:rPr>
+          <w:i/>
+          <w:iCs/>
+        </w:rPr>
+        <w:t xml:space="preserve"> </w:t>
+      </w:r>
+      <w:r>
+        <w:rPr>
+          <w:i/>
+          <w:iCs/>
+        </w:rPr>
+        <w:t xml:space="preserve">in the</w:t>
+      </w:r>
+      <w:r>
+        <w:rPr>
+          <w:i/>
+          <w:iCs/>
+        </w:rPr>
+        <w:t xml:space="preserve"> </w:t>
+      </w:r>
+      <w:r>
+        <w:rPr>
+          <w:i/>
+          <w:iCs/>
+        </w:rPr>
+        <w:t xml:space="preserve">Treatment</w:t>
+      </w:r>
+      <w:r>
+        <w:rPr>
+          <w:i/>
+          <w:iCs/>
+        </w:rPr>
+        <w:t xml:space="preserve"> </w:t>
+      </w:r>
+      <w:r>
+        <w:rPr>
+          <w:i/>
+          <w:iCs/>
+        </w:rPr>
+        <w:t xml:space="preserve">of</w:t>
+      </w:r>
+      <w:r>
+        <w:rPr>
+          <w:i/>
+          <w:iCs/>
+        </w:rPr>
+        <w:t xml:space="preserve"> </w:t>
+      </w:r>
+      <w:r>
+        <w:rPr>
+          <w:i/>
+          <w:iCs/>
+        </w:rPr>
+        <w:t xml:space="preserve">Addictive Behaviors</w:t>
+      </w:r>
+      <w:r>
+        <w:t xml:space="preserve"> </w:t>
+      </w:r>
+      <w:r>
+        <w:t xml:space="preserve">(2nd edition). The Guilford Press.</w:t>
+      </w:r>
+    </w:p>
     <w:bookmarkEnd w:id="114"/>
-    <w:bookmarkStart w:id="115" w:name="ref-marlattRelapsePreventionSecond2007"/>
+    <w:bookmarkStart w:id="116" w:name="ref-martinNeedReceiptSubstance2022"/>
     <w:p>
       <w:pPr>
         <w:pStyle w:val="Bibliography"/>
       </w:pPr>
       <w:r>
-        <w:t xml:space="preserve">Marlatt, G. A., &amp; Donovan, D. M. (Eds.). (2007).</w:t>
-      </w:r>
-      <w:r>
-        <w:t xml:space="preserve"> </w:t>
-      </w:r>
-      <w:r>
-        <w:rPr>
-          <w:i/>
-          <w:iCs/>
-        </w:rPr>
-        <w:t xml:space="preserve">Relapse</w:t>
-      </w:r>
-      <w:r>
-        <w:rPr>
-          <w:i/>
-          <w:iCs/>
-        </w:rPr>
-        <w:t xml:space="preserve"> </w:t>
-      </w:r>
-      <w:r>
-        <w:rPr>
-          <w:i/>
-          <w:iCs/>
-        </w:rPr>
-        <w:t xml:space="preserve">Prevention</w:t>
-      </w:r>
-      <w:r>
-        <w:rPr>
-          <w:i/>
-          <w:iCs/>
-        </w:rPr>
+        <w:t xml:space="preserve">Martin, C. E., Parlier-Ahmad, A. B., Beck, L., Scialli, A., &amp; Terplan, M. (2022). Need for and</w:t>
+      </w:r>
+      <w:r>
+        <w:t xml:space="preserve"> </w:t>
+      </w:r>
+      <w:r>
+        <w:t xml:space="preserve">Receipt</w:t>
+      </w:r>
+      <w:r>
+        <w:t xml:space="preserve"> </w:t>
+      </w:r>
+      <w:r>
+        <w:t xml:space="preserve">of</w:t>
+      </w:r>
+      <w:r>
+        <w:t xml:space="preserve"> </w:t>
+      </w:r>
+      <w:r>
+        <w:t xml:space="preserve">Substance Use Disorder Treatment Among Adults</w:t>
+      </w:r>
+      <w:r>
+        <w:t xml:space="preserve">, by</w:t>
+      </w:r>
+      <w:r>
+        <w:t xml:space="preserve"> </w:t>
+      </w:r>
+      <w:r>
+        <w:t xml:space="preserve">Gender</w:t>
+      </w:r>
+      <w:r>
+        <w:t xml:space="preserve">, in the</w:t>
+      </w:r>
+      <w:r>
+        <w:t xml:space="preserve"> </w:t>
+      </w:r>
+      <w:r>
+        <w:t xml:space="preserve">United States</w:t>
+      </w:r>
+      <w:r>
+        <w:t xml:space="preserve">.</w:t>
+      </w:r>
+      <w:r>
+        <w:t xml:space="preserve"> </w:t>
+      </w:r>
+      <w:r>
+        <w:rPr>
+          <w:i/>
+          <w:iCs/>
+        </w:rPr>
+        <w:t xml:space="preserve">Public Health Reports</w:t>
+      </w:r>
+      <w:r>
+        <w:rPr>
+          <w:i/>
+          <w:iCs/>
+        </w:rPr>
+        <w:t xml:space="preserve">®</w:t>
+      </w:r>
+      <w:r>
         <w:t xml:space="preserve">,</w:t>
       </w:r>
       <w:r>
-        <w:rPr>
-          <w:i/>
-          <w:iCs/>
-        </w:rPr>
-        <w:t xml:space="preserve"> </w:t>
-      </w:r>
-      <w:r>
-        <w:rPr>
-          <w:i/>
-          <w:iCs/>
-        </w:rPr>
-        <w:t xml:space="preserve">Second Edition</w:t>
-      </w:r>
-      <w:r>
-        <w:rPr>
-          <w:i/>
-          <w:iCs/>
-        </w:rPr>
-        <w:t xml:space="preserve">:</w:t>
-      </w:r>
-      <w:r>
-        <w:rPr>
-          <w:i/>
-          <w:iCs/>
-        </w:rPr>
-        <w:t xml:space="preserve"> </w:t>
-      </w:r>
-      <w:r>
-        <w:rPr>
-          <w:i/>
-          <w:iCs/>
-        </w:rPr>
-        <w:t xml:space="preserve">Maintenance Strategies</w:t>
-      </w:r>
-      <w:r>
-        <w:rPr>
-          <w:i/>
-          <w:iCs/>
-        </w:rPr>
-        <w:t xml:space="preserve"> </w:t>
-      </w:r>
-      <w:r>
-        <w:rPr>
-          <w:i/>
-          <w:iCs/>
-        </w:rPr>
-        <w:t xml:space="preserve">in the</w:t>
-      </w:r>
-      <w:r>
-        <w:rPr>
-          <w:i/>
-          <w:iCs/>
-        </w:rPr>
-        <w:t xml:space="preserve"> </w:t>
-      </w:r>
-      <w:r>
-        <w:rPr>
-          <w:i/>
-          <w:iCs/>
-        </w:rPr>
-        <w:t xml:space="preserve">Treatment</w:t>
-      </w:r>
-      <w:r>
-        <w:rPr>
-          <w:i/>
-          <w:iCs/>
-        </w:rPr>
-        <w:t xml:space="preserve"> </w:t>
-      </w:r>
-      <w:r>
-        <w:rPr>
-          <w:i/>
-          <w:iCs/>
-        </w:rPr>
-        <w:t xml:space="preserve">of</w:t>
-      </w:r>
-      <w:r>
-        <w:rPr>
-          <w:i/>
-          <w:iCs/>
-        </w:rPr>
-        <w:t xml:space="preserve"> </w:t>
-      </w:r>
-      <w:r>
-        <w:rPr>
-          <w:i/>
-          <w:iCs/>
-        </w:rPr>
-        <w:t xml:space="preserve">Addictive Behaviors</w:t>
-      </w:r>
-      <w:r>
-        <w:t xml:space="preserve"> </w:t>
-      </w:r>
-      <w:r>
-        <w:t xml:space="preserve">(2nd edition). The Guilford Press.</w:t>
-      </w:r>
-    </w:p>
-    <w:bookmarkEnd w:id="115"/>
-    <w:bookmarkStart w:id="117" w:name="ref-martinNeedReceiptSubstance2022"/>
-    <w:p>
-      <w:pPr>
-        <w:pStyle w:val="Bibliography"/>
-      </w:pPr>
-      <w:r>
-        <w:t xml:space="preserve">Martin, C. E., Parlier-Ahmad, A. B., Beck, L., Scialli, A., &amp; Terplan, M. (2022). Need for and</w:t>
-      </w:r>
-      <w:r>
-        <w:t xml:space="preserve"> </w:t>
-      </w:r>
-      <w:r>
-        <w:t xml:space="preserve">Receipt</w:t>
-      </w:r>
-      <w:r>
-        <w:t xml:space="preserve"> </w:t>
-      </w:r>
-      <w:r>
-        <w:t xml:space="preserve">of</w:t>
-      </w:r>
-      <w:r>
-        <w:t xml:space="preserve"> </w:t>
-      </w:r>
-      <w:r>
-        <w:t xml:space="preserve">Substance Use Disorder Treatment Among Adults</w:t>
-      </w:r>
-      <w:r>
-        <w:t xml:space="preserve">, by</w:t>
-      </w:r>
-      <w:r>
-        <w:t xml:space="preserve"> </w:t>
-      </w:r>
-      <w:r>
-        <w:t xml:space="preserve">Gender</w:t>
-      </w:r>
-      <w:r>
-        <w:t xml:space="preserve">, in the</w:t>
-      </w:r>
-      <w:r>
-        <w:t xml:space="preserve"> </w:t>
-      </w:r>
-      <w:r>
-        <w:t xml:space="preserve">United States</w:t>
-      </w:r>
-      <w:r>
-        <w:t xml:space="preserve">.</w:t>
-      </w:r>
-      <w:r>
-        <w:t xml:space="preserve"> </w:t>
-      </w:r>
-      <w:r>
-        <w:rPr>
-          <w:i/>
-          <w:iCs/>
-        </w:rPr>
-        <w:t xml:space="preserve">Public Health Reports</w:t>
-      </w:r>
-      <w:r>
-        <w:rPr>
-          <w:i/>
-          <w:iCs/>
-        </w:rPr>
-        <w:t xml:space="preserve">®</w:t>
-      </w:r>
-      <w:r>
-        <w:t xml:space="preserve">,</w:t>
-      </w:r>
-      <w:r>
         <w:t xml:space="preserve"> </w:t>
       </w:r>
       <w:r>
@@ -7701,7 +7691,7 @@
       <w:r>
         <w:t xml:space="preserve"> </w:t>
       </w:r>
-      <w:hyperlink r:id="rId116">
+      <w:hyperlink r:id="rId115">
         <w:r>
           <w:rPr>
             <w:rStyle w:val="Hyperlink"/>
@@ -7710,8 +7700,8 @@
         </w:r>
       </w:hyperlink>
     </w:p>
-    <w:bookmarkEnd w:id="117"/>
-    <w:bookmarkStart w:id="119" w:name="ref-mchughSexGenderDifferences2018"/>
+    <w:bookmarkEnd w:id="116"/>
+    <w:bookmarkStart w:id="118" w:name="ref-mchughSexGenderDifferences2018"/>
     <w:p>
       <w:pPr>
         <w:pStyle w:val="Bibliography"/>
@@ -7748,7 +7738,7 @@
       <w:r>
         <w:t xml:space="preserve"> </w:t>
       </w:r>
-      <w:hyperlink r:id="rId118">
+      <w:hyperlink r:id="rId117">
         <w:r>
           <w:rPr>
             <w:rStyle w:val="Hyperlink"/>
@@ -7757,8 +7747,8 @@
         </w:r>
       </w:hyperlink>
     </w:p>
-    <w:bookmarkEnd w:id="119"/>
-    <w:bookmarkStart w:id="121" w:name="ref-mohrPersonalSensingUnderstanding2017"/>
+    <w:bookmarkEnd w:id="118"/>
+    <w:bookmarkStart w:id="120" w:name="ref-mohrPersonalSensingUnderstanding2017"/>
     <w:p>
       <w:pPr>
         <w:pStyle w:val="Bibliography"/>
@@ -7825,7 +7815,7 @@
       <w:r>
         <w:t xml:space="preserve"> </w:t>
       </w:r>
-      <w:hyperlink r:id="rId120">
+      <w:hyperlink r:id="rId119">
         <w:r>
           <w:rPr>
             <w:rStyle w:val="Hyperlink"/>
@@ -7834,8 +7824,8 @@
         </w:r>
       </w:hyperlink>
     </w:p>
-    <w:bookmarkEnd w:id="121"/>
-    <w:bookmarkStart w:id="123" w:name="X1f44e09282148d362bdacfce67d6a56b1cf06db"/>
+    <w:bookmarkEnd w:id="120"/>
+    <w:bookmarkStart w:id="122" w:name="X1f44e09282148d362bdacfce67d6a56b1cf06db"/>
     <w:p>
       <w:pPr>
         <w:pStyle w:val="Bibliography"/>
@@ -7926,7 +7916,7 @@
       <w:r>
         <w:t xml:space="preserve"> </w:t>
       </w:r>
-      <w:hyperlink r:id="rId122">
+      <w:hyperlink r:id="rId121">
         <w:r>
           <w:rPr>
             <w:rStyle w:val="Hyperlink"/>
@@ -7935,8 +7925,8 @@
         </w:r>
       </w:hyperlink>
     </w:p>
-    <w:bookmarkEnd w:id="123"/>
-    <w:bookmarkStart w:id="125" w:name="ref-olfsonHealthcareCoverageService2022"/>
+    <w:bookmarkEnd w:id="122"/>
+    <w:bookmarkStart w:id="124" w:name="ref-olfsonHealthcareCoverageService2022"/>
     <w:p>
       <w:pPr>
         <w:pStyle w:val="Bibliography"/>
@@ -7973,7 +7963,7 @@
       <w:r>
         <w:t xml:space="preserve"> </w:t>
       </w:r>
-      <w:hyperlink r:id="rId124">
+      <w:hyperlink r:id="rId123">
         <w:r>
           <w:rPr>
             <w:rStyle w:val="Hyperlink"/>
@@ -7982,8 +7972,8 @@
         </w:r>
       </w:hyperlink>
     </w:p>
-    <w:bookmarkEnd w:id="125"/>
-    <w:bookmarkStart w:id="127" w:name="ref-parlier-ahmadExploratoryStudySex2021"/>
+    <w:bookmarkEnd w:id="124"/>
+    <w:bookmarkStart w:id="126" w:name="ref-parlier-ahmadExploratoryStudySex2021"/>
     <w:p>
       <w:pPr>
         <w:pStyle w:val="Bibliography"/>
@@ -8020,7 +8010,7 @@
       <w:r>
         <w:t xml:space="preserve"> </w:t>
       </w:r>
-      <w:hyperlink r:id="rId126">
+      <w:hyperlink r:id="rId125">
         <w:r>
           <w:rPr>
             <w:rStyle w:val="Hyperlink"/>
@@ -8029,8 +8019,8 @@
         </w:r>
       </w:hyperlink>
     </w:p>
-    <w:bookmarkEnd w:id="127"/>
-    <w:bookmarkStart w:id="129" w:name="ref-pinedoCurrentReexaminationRacial2019"/>
+    <w:bookmarkEnd w:id="126"/>
+    <w:bookmarkStart w:id="128" w:name="ref-pinedoCurrentReexaminationRacial2019"/>
     <w:p>
       <w:pPr>
         <w:pStyle w:val="Bibliography"/>
@@ -8079,7 +8069,7 @@
       <w:r>
         <w:t xml:space="preserve"> </w:t>
       </w:r>
-      <w:hyperlink r:id="rId128">
+      <w:hyperlink r:id="rId127">
         <w:r>
           <w:rPr>
             <w:rStyle w:val="Hyperlink"/>
@@ -8088,39 +8078,39 @@
         </w:r>
       </w:hyperlink>
     </w:p>
+    <w:bookmarkEnd w:id="128"/>
+    <w:bookmarkStart w:id="129" w:name="ref-plattProbabilisticOutputsSupport1999"/>
+    <w:p>
+      <w:pPr>
+        <w:pStyle w:val="Bibliography"/>
+      </w:pPr>
+      <w:r>
+        <w:t xml:space="preserve">Platt, J. (1999). Probabilistic outputs for support vector machines and comparisons to regularized likelihood methods. In</w:t>
+      </w:r>
+      <w:r>
+        <w:t xml:space="preserve"> </w:t>
+      </w:r>
+      <w:r>
+        <w:rPr>
+          <w:i/>
+          <w:iCs/>
+        </w:rPr>
+        <w:t xml:space="preserve">Advances in large margin classifiers</w:t>
+      </w:r>
+      <w:r>
+        <w:t xml:space="preserve"> </w:t>
+      </w:r>
+      <w:r>
+        <w:t xml:space="preserve">(pp. 61–74). MIT Press.</w:t>
+      </w:r>
+    </w:p>
     <w:bookmarkEnd w:id="129"/>
-    <w:bookmarkStart w:id="130" w:name="ref-plattProbabilisticOutputsSupport1999"/>
+    <w:bookmarkStart w:id="131" w:name="ref-pulickIdiographicLapsePrediction2025"/>
     <w:p>
       <w:pPr>
         <w:pStyle w:val="Bibliography"/>
       </w:pPr>
       <w:r>
-        <w:t xml:space="preserve">Platt, J. (1999). Probabilistic outputs for support vector machines and comparisons to regularized likelihood methods. In</w:t>
-      </w:r>
-      <w:r>
-        <w:t xml:space="preserve"> </w:t>
-      </w:r>
-      <w:r>
-        <w:rPr>
-          <w:i/>
-          <w:iCs/>
-        </w:rPr>
-        <w:t xml:space="preserve">Advances in large margin classifiers</w:t>
-      </w:r>
-      <w:r>
-        <w:t xml:space="preserve"> </w:t>
-      </w:r>
-      <w:r>
-        <w:t xml:space="preserve">(pp. 61–74). MIT Press.</w:t>
-      </w:r>
-    </w:p>
-    <w:bookmarkEnd w:id="130"/>
-    <w:bookmarkStart w:id="132" w:name="ref-pulickIdiographicLapsePrediction2025"/>
-    <w:p>
-      <w:pPr>
-        <w:pStyle w:val="Bibliography"/>
-      </w:pPr>
-      <w:r>
         <w:t xml:space="preserve">Pulick, E., Curtin, J., &amp; Mintz, Y. (2025). Idiographic</w:t>
       </w:r>
       <w:r>
@@ -8182,7 +8172,7 @@
       <w:r>
         <w:t xml:space="preserve"> </w:t>
       </w:r>
-      <w:hyperlink r:id="rId131">
+      <w:hyperlink r:id="rId130">
         <w:r>
           <w:rPr>
             <w:rStyle w:val="Hyperlink"/>
@@ -8191,8 +8181,8 @@
         </w:r>
       </w:hyperlink>
     </w:p>
-    <w:bookmarkEnd w:id="132"/>
-    <w:bookmarkStart w:id="134" w:name="ref-salonerBlacksHispanicsAre2013"/>
+    <w:bookmarkEnd w:id="131"/>
+    <w:bookmarkStart w:id="133" w:name="ref-salonerBlacksHispanicsAre2013"/>
     <w:p>
       <w:pPr>
         <w:pStyle w:val="Bibliography"/>
@@ -8241,7 +8231,7 @@
       <w:r>
         <w:t xml:space="preserve"> </w:t>
       </w:r>
-      <w:hyperlink r:id="rId133">
+      <w:hyperlink r:id="rId132">
         <w:r>
           <w:rPr>
             <w:rStyle w:val="Hyperlink"/>
@@ -8250,8 +8240,8 @@
         </w:r>
       </w:hyperlink>
     </w:p>
-    <w:bookmarkEnd w:id="134"/>
-    <w:bookmarkStart w:id="136" w:name="ref-schmidtEthnicDisparitiesClinical2007"/>
+    <w:bookmarkEnd w:id="133"/>
+    <w:bookmarkStart w:id="135" w:name="ref-schmidtEthnicDisparitiesClinical2007"/>
     <w:p>
       <w:pPr>
         <w:pStyle w:val="Bibliography"/>
@@ -8297,7 +8287,7 @@
       <w:r>
         <w:t xml:space="preserve"> </w:t>
       </w:r>
-      <w:hyperlink r:id="rId135">
+      <w:hyperlink r:id="rId134">
         <w:r>
           <w:rPr>
             <w:rStyle w:val="Hyperlink"/>
@@ -8306,8 +8296,8 @@
         </w:r>
       </w:hyperlink>
     </w:p>
-    <w:bookmarkEnd w:id="136"/>
-    <w:bookmarkStart w:id="138" w:name="ref-sigmonAccessTreatmentOpioid2014"/>
+    <w:bookmarkEnd w:id="135"/>
+    <w:bookmarkStart w:id="137" w:name="ref-sigmonAccessTreatmentOpioid2014"/>
     <w:p>
       <w:pPr>
         <w:pStyle w:val="Bibliography"/>
@@ -8353,7 +8343,7 @@
       <w:r>
         <w:t xml:space="preserve"> </w:t>
       </w:r>
-      <w:hyperlink r:id="rId137">
+      <w:hyperlink r:id="rId136">
         <w:r>
           <w:rPr>
             <w:rStyle w:val="Hyperlink"/>
@@ -8362,8 +8352,8 @@
         </w:r>
       </w:hyperlink>
     </w:p>
-    <w:bookmarkEnd w:id="138"/>
-    <w:bookmarkStart w:id="140" w:name="ref-stantonRelapsePreventionNeeds2005a"/>
+    <w:bookmarkEnd w:id="137"/>
+    <w:bookmarkStart w:id="139" w:name="ref-stantonRelapsePreventionNeeds2005a"/>
     <w:p>
       <w:pPr>
         <w:pStyle w:val="Bibliography"/>
@@ -8421,7 +8411,7 @@
       <w:r>
         <w:t xml:space="preserve"> </w:t>
       </w:r>
-      <w:hyperlink r:id="rId139">
+      <w:hyperlink r:id="rId138">
         <w:r>
           <w:rPr>
             <w:rStyle w:val="Hyperlink"/>
@@ -8430,71 +8420,71 @@
         </w:r>
       </w:hyperlink>
     </w:p>
+    <w:bookmarkEnd w:id="139"/>
+    <w:bookmarkStart w:id="140" w:name="X28b8f85e424928e66706a578d6053e0308d1105"/>
+    <w:p>
+      <w:pPr>
+        <w:pStyle w:val="Bibliography"/>
+      </w:pPr>
+      <w:r>
+        <w:t xml:space="preserve">Substance Abuse and Mental Health Services Administration. (n.d.).</w:t>
+      </w:r>
+      <w:r>
+        <w:t xml:space="preserve"> </w:t>
+      </w:r>
+      <w:r>
+        <w:rPr>
+          <w:i/>
+          <w:iCs/>
+        </w:rPr>
+        <w:t xml:space="preserve">2024</w:t>
+      </w:r>
+      <w:r>
+        <w:rPr>
+          <w:i/>
+          <w:iCs/>
+        </w:rPr>
+        <w:t xml:space="preserve"> </w:t>
+      </w:r>
+      <w:r>
+        <w:rPr>
+          <w:i/>
+          <w:iCs/>
+        </w:rPr>
+        <w:t xml:space="preserve">NSDUH Detailed Tables</w:t>
+      </w:r>
+      <w:r>
+        <w:rPr>
+          <w:i/>
+          <w:iCs/>
+        </w:rPr>
+        <w:t xml:space="preserve"> </w:t>
+      </w:r>
+      <w:r>
+        <w:rPr>
+          <w:i/>
+          <w:iCs/>
+        </w:rPr>
+        <w:t xml:space="preserve"> </w:t>
+      </w:r>
+      <w:r>
+        <w:rPr>
+          <w:i/>
+          <w:iCs/>
+        </w:rPr>
+        <w:t xml:space="preserve">CBHSQ Data</w:t>
+      </w:r>
+      <w:r>
+        <w:t xml:space="preserve">. https://www.samhsa.gov/data/report/2024-nsduh-detailed-tables.</w:t>
+      </w:r>
+    </w:p>
     <w:bookmarkEnd w:id="140"/>
-    <w:bookmarkStart w:id="141" w:name="X28b8f85e424928e66706a578d6053e0308d1105"/>
+    <w:bookmarkStart w:id="142" w:name="X52c4c4b564080b2dbcc4b68874ef8a36e7b0a07"/>
     <w:p>
       <w:pPr>
         <w:pStyle w:val="Bibliography"/>
       </w:pPr>
       <w:r>
-        <w:t xml:space="preserve">Substance Abuse and Mental Health Services Administration. (n.d.).</w:t>
-      </w:r>
-      <w:r>
-        <w:t xml:space="preserve"> </w:t>
-      </w:r>
-      <w:r>
-        <w:rPr>
-          <w:i/>
-          <w:iCs/>
-        </w:rPr>
-        <w:t xml:space="preserve">2024</w:t>
-      </w:r>
-      <w:r>
-        <w:rPr>
-          <w:i/>
-          <w:iCs/>
-        </w:rPr>
-        <w:t xml:space="preserve"> </w:t>
-      </w:r>
-      <w:r>
-        <w:rPr>
-          <w:i/>
-          <w:iCs/>
-        </w:rPr>
-        <w:t xml:space="preserve">NSDUH Detailed Tables</w:t>
-      </w:r>
-      <w:r>
-        <w:rPr>
-          <w:i/>
-          <w:iCs/>
-        </w:rPr>
-        <w:t xml:space="preserve"> </w:t>
-      </w:r>
-      <w:r>
-        <w:rPr>
-          <w:i/>
-          <w:iCs/>
-        </w:rPr>
-        <w:t xml:space="preserve"> </w:t>
-      </w:r>
-      <w:r>
-        <w:rPr>
-          <w:i/>
-          <w:iCs/>
-        </w:rPr>
-        <w:t xml:space="preserve">CBHSQ Data</w:t>
-      </w:r>
-      <w:r>
-        <w:t xml:space="preserve">. https://www.samhsa.gov/data/report/2024-nsduh-detailed-tables.</w:t>
-      </w:r>
-    </w:p>
-    <w:bookmarkEnd w:id="141"/>
-    <w:bookmarkStart w:id="143" w:name="X52c4c4b564080b2dbcc4b68874ef8a36e7b0a07"/>
-    <w:p>
-      <w:pPr>
-        <w:pStyle w:val="Bibliography"/>
-      </w:pPr>
-      <w:r>
         <w:t xml:space="preserve">Van Calster, B., Collins, G. S., Vickers, A. J., Wynants, L., Kerr, K. F., Barreñada, L., Varoquaux, G., Singh, K., Moons, K. G., Hernandez-Boussard, T., Timmerman, D., McLernon, D. J., Van Smeden, M., &amp; Steyerberg, E. W. (2025). Evaluation of performance measures in predictive artificial intelligence models to support medical decisions: Overview and guidance.</w:t>
       </w:r>
       <w:r>
@@ -8513,7 +8503,7 @@
       <w:r>
         <w:t xml:space="preserve"> </w:t>
       </w:r>
-      <w:hyperlink r:id="rId142">
+      <w:hyperlink r:id="rId141">
         <w:r>
           <w:rPr>
             <w:rStyle w:val="Hyperlink"/>
@@ -8522,8 +8512,8 @@
         </w:r>
       </w:hyperlink>
     </w:p>
-    <w:bookmarkEnd w:id="143"/>
-    <w:bookmarkStart w:id="145" w:name="X6ee708186a5d814f6044b48499818110320664f"/>
+    <w:bookmarkEnd w:id="142"/>
+    <w:bookmarkStart w:id="144" w:name="X6ee708186a5d814f6044b48499818110320664f"/>
     <w:p>
       <w:pPr>
         <w:pStyle w:val="Bibliography"/>
@@ -8560,7 +8550,7 @@
       <w:r>
         <w:t xml:space="preserve"> </w:t>
       </w:r>
-      <w:hyperlink r:id="rId144">
+      <w:hyperlink r:id="rId143">
         <w:r>
           <w:rPr>
             <w:rStyle w:val="Hyperlink"/>
@@ -8569,8 +8559,8 @@
         </w:r>
       </w:hyperlink>
     </w:p>
-    <w:bookmarkEnd w:id="145"/>
-    <w:bookmarkStart w:id="147" w:name="ref-walitzerGenderDifferencesAlcohol2006"/>
+    <w:bookmarkEnd w:id="144"/>
+    <w:bookmarkStart w:id="146" w:name="ref-walitzerGenderDifferencesAlcohol2006"/>
     <w:p>
       <w:pPr>
         <w:pStyle w:val="Bibliography"/>
@@ -8607,7 +8597,7 @@
       <w:r>
         <w:t xml:space="preserve"> </w:t>
       </w:r>
-      <w:hyperlink r:id="rId146">
+      <w:hyperlink r:id="rId145">
         <w:r>
           <w:rPr>
             <w:rStyle w:val="Hyperlink"/>
@@ -8616,81 +8606,81 @@
         </w:r>
       </w:hyperlink>
     </w:p>
+    <w:bookmarkEnd w:id="146"/>
+    <w:bookmarkStart w:id="147" w:name="X00d53e799ac148a12fd23d85f7c587e1d44cff6"/>
+    <w:p>
+      <w:pPr>
+        <w:pStyle w:val="Bibliography"/>
+      </w:pPr>
+      <w:r>
+        <w:t xml:space="preserve">Witkiewitz, K. A., &amp; Marlatt, G. A. (Eds.). (2007).</w:t>
+      </w:r>
+      <w:r>
+        <w:t xml:space="preserve"> </w:t>
+      </w:r>
+      <w:r>
+        <w:rPr>
+          <w:i/>
+          <w:iCs/>
+        </w:rPr>
+        <w:t xml:space="preserve">Therapist’s</w:t>
+      </w:r>
+      <w:r>
+        <w:rPr>
+          <w:i/>
+          <w:iCs/>
+        </w:rPr>
+        <w:t xml:space="preserve"> </w:t>
+      </w:r>
+      <w:r>
+        <w:rPr>
+          <w:i/>
+          <w:iCs/>
+        </w:rPr>
+        <w:t xml:space="preserve">Guide</w:t>
+      </w:r>
+      <w:r>
+        <w:rPr>
+          <w:i/>
+          <w:iCs/>
+        </w:rPr>
+        <w:t xml:space="preserve"> </w:t>
+      </w:r>
+      <w:r>
+        <w:rPr>
+          <w:i/>
+          <w:iCs/>
+        </w:rPr>
+        <w:t xml:space="preserve">to</w:t>
+      </w:r>
+      <w:r>
+        <w:rPr>
+          <w:i/>
+          <w:iCs/>
+        </w:rPr>
+        <w:t xml:space="preserve"> </w:t>
+      </w:r>
+      <w:r>
+        <w:rPr>
+          <w:i/>
+          <w:iCs/>
+        </w:rPr>
+        <w:t xml:space="preserve">Evidence-Based Relapse Prevention</w:t>
+      </w:r>
+      <w:r>
+        <w:t xml:space="preserve"> </w:t>
+      </w:r>
+      <w:r>
+        <w:t xml:space="preserve">(1st edition). Academic Press.</w:t>
+      </w:r>
+    </w:p>
     <w:bookmarkEnd w:id="147"/>
-    <w:bookmarkStart w:id="148" w:name="X00d53e799ac148a12fd23d85f7c587e1d44cff6"/>
+    <w:bookmarkStart w:id="149" w:name="X4446e184b7dd55a61fd406499f32542fdcf24b5"/>
     <w:p>
       <w:pPr>
         <w:pStyle w:val="Bibliography"/>
       </w:pPr>
       <w:r>
-        <w:t xml:space="preserve">Witkiewitz, K. A., &amp; Marlatt, G. A. (Eds.). (2007).</w:t>
-      </w:r>
-      <w:r>
-        <w:t xml:space="preserve"> </w:t>
-      </w:r>
-      <w:r>
-        <w:rPr>
-          <w:i/>
-          <w:iCs/>
-        </w:rPr>
-        <w:t xml:space="preserve">Therapist’s</w:t>
-      </w:r>
-      <w:r>
-        <w:rPr>
-          <w:i/>
-          <w:iCs/>
-        </w:rPr>
-        <w:t xml:space="preserve"> </w:t>
-      </w:r>
-      <w:r>
-        <w:rPr>
-          <w:i/>
-          <w:iCs/>
-        </w:rPr>
-        <w:t xml:space="preserve">Guide</w:t>
-      </w:r>
-      <w:r>
-        <w:rPr>
-          <w:i/>
-          <w:iCs/>
-        </w:rPr>
-        <w:t xml:space="preserve"> </w:t>
-      </w:r>
-      <w:r>
-        <w:rPr>
-          <w:i/>
-          <w:iCs/>
-        </w:rPr>
-        <w:t xml:space="preserve">to</w:t>
-      </w:r>
-      <w:r>
-        <w:rPr>
-          <w:i/>
-          <w:iCs/>
-        </w:rPr>
-        <w:t xml:space="preserve"> </w:t>
-      </w:r>
-      <w:r>
-        <w:rPr>
-          <w:i/>
-          <w:iCs/>
-        </w:rPr>
-        <w:t xml:space="preserve">Evidence-Based Relapse Prevention</w:t>
-      </w:r>
-      <w:r>
-        <w:t xml:space="preserve"> </w:t>
-      </w:r>
-      <w:r>
-        <w:t xml:space="preserve">(1st edition). Academic Press.</w:t>
-      </w:r>
-    </w:p>
-    <w:bookmarkEnd w:id="148"/>
-    <w:bookmarkStart w:id="150" w:name="X4446e184b7dd55a61fd406499f32542fdcf24b5"/>
-    <w:p>
-      <w:pPr>
-        <w:pStyle w:val="Bibliography"/>
-      </w:pPr>
-      <w:r>
         <w:t xml:space="preserve">Witkiewitz, K., &amp; Marlatt, G. A. (2004). Relapse prevention for alcohol and drug problems:</w:t>
       </w:r>
       <w:r>
@@ -8734,7 +8724,7 @@
       <w:r>
         <w:t xml:space="preserve"> </w:t>
       </w:r>
-      <w:hyperlink r:id="rId149">
+      <w:hyperlink r:id="rId148">
         <w:r>
           <w:rPr>
             <w:rStyle w:val="Hyperlink"/>
@@ -8743,8 +8733,8 @@
         </w:r>
       </w:hyperlink>
     </w:p>
-    <w:bookmarkEnd w:id="150"/>
-    <w:bookmarkStart w:id="152" w:name="ref-woodLotPeopleCall2019"/>
+    <w:bookmarkEnd w:id="149"/>
+    <w:bookmarkStart w:id="151" w:name="ref-woodLotPeopleCall2019"/>
     <w:p>
       <w:pPr>
         <w:pStyle w:val="Bibliography"/>
@@ -8802,7 +8792,7 @@
       <w:r>
         <w:t xml:space="preserve"> </w:t>
       </w:r>
-      <w:hyperlink r:id="rId151">
+      <w:hyperlink r:id="rId150">
         <w:r>
           <w:rPr>
             <w:rStyle w:val="Hyperlink"/>
@@ -8811,8 +8801,8 @@
         </w:r>
       </w:hyperlink>
     </w:p>
-    <w:bookmarkEnd w:id="152"/>
-    <w:bookmarkStart w:id="154" w:name="Xb35ee182d565575e339a0170868456c1684f821"/>
+    <w:bookmarkEnd w:id="151"/>
+    <w:bookmarkStart w:id="153" w:name="Xb35ee182d565575e339a0170868456c1684f821"/>
     <w:p>
       <w:pPr>
         <w:pStyle w:val="Bibliography"/>
@@ -8867,7 +8857,7 @@
       <w:r>
         <w:t xml:space="preserve"> </w:t>
       </w:r>
-      <w:hyperlink r:id="rId153">
+      <w:hyperlink r:id="rId152">
         <w:r>
           <w:rPr>
             <w:rStyle w:val="Hyperlink"/>
@@ -8876,8 +8866,8 @@
         </w:r>
       </w:hyperlink>
     </w:p>
-    <w:bookmarkEnd w:id="154"/>
-    <w:bookmarkStart w:id="156" w:name="ref-wyantMachineLearningModels2024"/>
+    <w:bookmarkEnd w:id="153"/>
+    <w:bookmarkStart w:id="155" w:name="ref-wyantMachineLearningModels2024"/>
     <w:p>
       <w:pPr>
         <w:pStyle w:val="Bibliography"/>
@@ -8901,7 +8891,7 @@
       <w:r>
         <w:t xml:space="preserve"> </w:t>
       </w:r>
-      <w:hyperlink r:id="rId155">
+      <w:hyperlink r:id="rId154">
         <w:r>
           <w:rPr>
             <w:rStyle w:val="Hyperlink"/>
@@ -8910,8 +8900,8 @@
         </w:r>
       </w:hyperlink>
     </w:p>
-    <w:bookmarkEnd w:id="156"/>
-    <w:bookmarkStart w:id="158" w:name="X919c097397142f85d541b216884b2f657258800"/>
+    <w:bookmarkEnd w:id="155"/>
+    <w:bookmarkStart w:id="157" w:name="X919c097397142f85d541b216884b2f657258800"/>
     <w:p>
       <w:pPr>
         <w:pStyle w:val="Bibliography"/>
@@ -8975,7 +8965,7 @@
       <w:r>
         <w:t xml:space="preserve"> </w:t>
       </w:r>
-      <w:hyperlink r:id="rId157">
+      <w:hyperlink r:id="rId156">
         <w:r>
           <w:rPr>
             <w:rStyle w:val="Hyperlink"/>
@@ -8984,9 +8974,9 @@
         </w:r>
       </w:hyperlink>
     </w:p>
+    <w:bookmarkEnd w:id="157"/>
     <w:bookmarkEnd w:id="158"/>
     <w:bookmarkEnd w:id="159"/>
-    <w:bookmarkEnd w:id="160"/>
     <w:sectPr>
       <w:footnotePr>
         <w:numRestart w:val="eachSect"/>

</xml_diff>